<commit_message>
docs(nsfc-demo): humanize review texts and fix LaTeX template details
- apply nsfc-humanization to polish three organ transplantation reviews
- fix bibliographystyle position, add .bib extension and \tightlist in LaTeX
- re-export PDF and Word documents after content and template updates
- update CHANGELOG, Prompts, contribution ledger and reviews README
</commit_message>
<xml_diff>
--- a/nsfc-demo/reviews/ddcfDNA-multiomics-rejection-monitoring/ddcfDNA-multiomics-rejection-monitoring_review.docx
+++ b/nsfc-demo/reviews/ddcfDNA-multiomics-rejection-monitoring/ddcfDNA-multiomics-rejection-monitoring_review.docx
@@ -68,16 +68,16 @@
         <w:rPr>
           <w:rFonts w:hint="eastAsia"/>
         </w:rPr>
-        <w:t xml:space="preserve">dd-cfDNA）已经成为近五年实体器官移植无创监测中最接近临床常规化的分子工具之一。其优势是对移植物细胞损伤高度敏感、可纵向重复采样，并能在肾、心、肺、肝等器官中与排斥、微血管炎症、供者特异性抗体和病理损伤形成关联。其弱点同样清楚：dd-cfDNA</w:t>
-      </w:r>
-      <w:r>
-        <w:t xml:space="preserve"> </w:t>
-      </w:r>
-      <w:r>
-        <w:rPr>
-          <w:rFonts w:hint="eastAsia"/>
-        </w:rPr>
-        <w:t xml:space="preserve">反映“损伤释放”，并不天然区分抗体介导排斥、T</w:t>
+        <w:t xml:space="preserve">dd-cfDNA）已经成为近五年实体器官移植无创监测中最接近临床常规化的分子工具之一。它对移植物细胞损伤高度敏感，可纵向重复采样，并能在肾、心、肺、肝等器官中与排斥、微血管炎症、供者特异性抗体和病理损伤形成关联。局限也同样明确：dd-cfDNA</w:t>
+      </w:r>
+      <w:r>
+        <w:t xml:space="preserve"> </w:t>
+      </w:r>
+      <w:r>
+        <w:rPr>
+          <w:rFonts w:hint="eastAsia"/>
+        </w:rPr>
+        <w:t xml:space="preserve">反映的是“损伤释放”，并不天然区分抗体介导排斥、T</w:t>
       </w:r>
       <w:r>
         <w:t xml:space="preserve"> </w:t>
@@ -95,7 +95,7 @@
         <w:rPr>
           <w:rFonts w:hint="eastAsia"/>
         </w:rPr>
-        <w:t xml:space="preserve">年，最可行且新颖的路线不是把</w:t>
+        <w:t xml:space="preserve">年，更可行也更有增量的路线，并不是把</w:t>
       </w:r>
       <w:r>
         <w:t xml:space="preserve"> dd-cfDNA </w:t>
@@ -104,7 +104,7 @@
         <w:rPr>
           <w:rFonts w:hint="eastAsia"/>
         </w:rPr>
-        <w:t xml:space="preserve">作为活检替代品，而是把它与</w:t>
+        <w:t xml:space="preserve">简单作为活检替代品，而是将其与</w:t>
       </w:r>
       <w:r>
         <w:t xml:space="preserve"> </w:t>
@@ -122,7 +122,7 @@
         <w:rPr>
           <w:rFonts w:hint="eastAsia"/>
         </w:rPr>
-        <w:t xml:space="preserve">mRNA、转录组、蛋白组、病毒负荷、免疫抑制暴露和机器灌注标志物整合成动态风险模型，用于决定何时活检、何时减免疫、何时强化治疗以及何时避免过度诊断。</w:t>
+        <w:t xml:space="preserve">mRNA、转录组、蛋白组、病毒负荷、免疫抑制暴露和机器灌注标志物整合为动态风险模型，用于判断何时活检、何时减免疫、何时强化治疗，以及何时避免过度诊断。</w:t>
       </w:r>
     </w:p>
     <w:bookmarkEnd w:id="9"/>
@@ -291,16 +291,16 @@
         <w:rPr>
           <w:rFonts w:hint="eastAsia"/>
         </w:rPr>
-        <w:t xml:space="preserve">近年证据也显示，dd-cfDNA</w:t>
-      </w:r>
-      <w:r>
-        <w:t xml:space="preserve"> </w:t>
-      </w:r>
-      <w:r>
-        <w:rPr>
-          <w:rFonts w:hint="eastAsia"/>
-        </w:rPr>
-        <w:t xml:space="preserve">在心、肺、肝和多器官移植中迅速扩展，但不同器官的基线、释放动力学、取样频率和干扰因素差异明显</w:t>
+        <w:t xml:space="preserve">近年证据还显示，dd-cfDNA</w:t>
+      </w:r>
+      <w:r>
+        <w:t xml:space="preserve"> </w:t>
+      </w:r>
+      <w:r>
+        <w:rPr>
+          <w:rFonts w:hint="eastAsia"/>
+        </w:rPr>
+        <w:t xml:space="preserve">正在心、肺、肝和多器官移植中迅速扩展，但不同器官的基线、释放动力学、取样频率和干扰因素差异明显</w:t>
       </w:r>
       <w:r>
         <w:t xml:space="preserve">(</w:t>
@@ -417,7 +417,7 @@
         <w:rPr>
           <w:rFonts w:hint="eastAsia"/>
         </w:rPr>
-        <w:t xml:space="preserve">的临床价值必须在器官特异性场景中解释，而不是用同一阈值横跨所有移植类型。</w:t>
+        <w:t xml:space="preserve">的临床价值需要放在器官特异性场景中解释，不能用同一阈值横跨所有移植类型。</w:t>
       </w:r>
     </w:p>
     <w:bookmarkEnd w:id="10"/>
@@ -669,7 +669,7 @@
         <w:rPr>
           <w:rFonts w:hint="eastAsia"/>
         </w:rPr>
-        <w:t xml:space="preserve">但肾移植也提醒我们不能过度承诺。dd-cfDNA</w:t>
+        <w:t xml:space="preserve">肾移植的经验也提醒我们不能过度承诺。dd-cfDNA</w:t>
       </w:r>
       <w:r>
         <w:t xml:space="preserve"> </w:t>
@@ -754,7 +754,7 @@
         <w:rPr>
           <w:rFonts w:hint="eastAsia"/>
         </w:rPr>
-        <w:t xml:space="preserve">。未来模型若只输出“阳性/阴性”，很难服务复杂门诊决策；更合理的是输出时间趋势、个体基线偏离和与其他证据的一致性。</w:t>
+        <w:t xml:space="preserve">。未来模型若只输出“阳性/阴性”，很难服务复杂门诊决策；更合理的输出应包括时间趋势、个体基线偏离，以及与其他证据的一致性。</w:t>
       </w:r>
     </w:p>
     <w:bookmarkEnd w:id="11"/>
@@ -1119,7 +1119,7 @@
         <w:rPr>
           <w:rFonts w:hint="eastAsia"/>
         </w:rPr>
-        <w:t xml:space="preserve">最大的临床短板是病因特异性不足，多组学的意义正是在这里。尿液外泌体</w:t>
+        <w:t xml:space="preserve">最大的临床短板是病因特异性不足，多组学的价值也正在这里体现出来。尿液外泌体</w:t>
       </w:r>
       <w:r>
         <w:t xml:space="preserve"> </w:t>
@@ -1343,7 +1343,7 @@
         <w:rPr>
           <w:rFonts w:hint="eastAsia"/>
         </w:rPr>
-        <w:t xml:space="preserve">第一个场景是低风险稳定患者的活检减量。若</w:t>
+        <w:t xml:space="preserve">临床应用可以先落在四类场景。低风险稳定患者若</w:t>
       </w:r>
       <w:r>
         <w:t xml:space="preserve"> dd-cfDNA </w:t>
@@ -1361,7 +1361,7 @@
         <w:rPr>
           <w:rFonts w:hint="eastAsia"/>
         </w:rPr>
-        <w:t xml:space="preserve">阴性、功能稳定且尿液/转录组无炎症信号，协议活检的收益可能下降。第二个场景是高风险患者的早期预警。免疫不依从、DSA</w:t>
+        <w:t xml:space="preserve">阴性、功能稳定且尿液/转录组无炎症信号，协议活检的收益可能下降。高风险患者，如免疫不依从、DSA</w:t>
       </w:r>
       <w:r>
         <w:t xml:space="preserve"> </w:t>
@@ -1388,7 +1388,7 @@
         <w:rPr>
           <w:rFonts w:hint="eastAsia"/>
         </w:rPr>
-        <w:t xml:space="preserve">趋势可帮助决定活检时点。第三个场景是治疗反应监测。ABMR</w:t>
+        <w:t xml:space="preserve">趋势可帮助决定活检时点。ABMR</w:t>
       </w:r>
       <w:r>
         <w:t xml:space="preserve"> </w:t>
@@ -1489,7 +1489,7 @@
         <w:rPr>
           <w:rFonts w:hint="eastAsia"/>
         </w:rPr>
-        <w:t xml:space="preserve">。第四个场景是免疫抑制精准化。dd-cfDNA</w:t>
+        <w:t xml:space="preserve">。在免疫抑制精准化方面，dd-cfDNA</w:t>
       </w:r>
       <w:r>
         <w:t xml:space="preserve"> </w:t>
@@ -1703,7 +1703,7 @@
         <w:rPr>
           <w:rFonts w:hint="eastAsia"/>
         </w:rPr>
-        <w:t xml:space="preserve">不是活检的简单替代品，也不是排斥的单一同义词。它最有前景的位置，是作为多证据动态监测系统中的核心损伤轴，与免疫风险、感染风险、组织/尿液组学和移植前器官质量共同构成临床决策模型。未来</w:t>
+        <w:t xml:space="preserve">不是活检的简单替代品，也不是排斥的单一同义词。它更合适的位置，是作为多证据动态监测系统中的核心损伤轴，与免疫风险、感染风险、组织/尿液组学和移植前器官质量共同构成临床决策模型。未来</w:t>
       </w:r>
       <w:r>
         <w:t xml:space="preserve"> 3-5 </w:t>
@@ -1712,7 +1712,7 @@
         <w:rPr>
           <w:rFonts w:hint="eastAsia"/>
         </w:rPr>
-        <w:t xml:space="preserve">年，真正能进入常规路径的方案，将是那些能减少不必要活检、避免过度治疗并改善长期结局的整合型监测策略。</w:t>
+        <w:t xml:space="preserve">年，能进入常规路径的方案，应当是那些能够减少不必要活检、避免过度治疗并改善长期结局的整合型监测策略。</w:t>
       </w:r>
     </w:p>
     <w:bookmarkStart w:id="196" w:name="refs"/>

</xml_diff>

<commit_message>
docs(nsfc-demo): expand ddcfDNA-multiomics rejection monitoring review with detailed content
- enrich abstract and introduction with cross-organ injury axis and dynamic risk framework
- expand renal transplant evidence boundaries, organ-specific fraction/absolute quantity, and multi-omics integration
- add machine perfusion priors, AI risk model discussion, and decision-trial design refinements
- re-export LaTeX PDF (14 pages) and Word via Pandoc; update verification report
</commit_message>
<xml_diff>
--- a/nsfc-demo/reviews/ddcfDNA-multiomics-rejection-monitoring/ddcfDNA-multiomics-rejection-monitoring_review.docx
+++ b/nsfc-demo/reviews/ddcfDNA-multiomics-rejection-monitoring/ddcfDNA-multiomics-rejection-monitoring_review.docx
@@ -68,7 +68,34 @@
         <w:rPr>
           <w:rFonts w:hint="eastAsia"/>
         </w:rPr>
-        <w:t xml:space="preserve">dd-cfDNA）已经成为近五年实体器官移植无创监测中最接近临床常规化的分子工具之一。它对移植物细胞损伤高度敏感，可纵向重复采样，并能在肾、心、肺、肝等器官中与排斥、微血管炎症、供者特异性抗体和病理损伤形成关联。局限也同样明确：dd-cfDNA</w:t>
+        <w:t xml:space="preserve">dd-cfDNA）已经成为近五年实体器官移植无创监测中最接近临床常规化的分子工具之一。它对移植物细胞损伤高度敏感，可纵向重复采样，并能在肾、心、肺、肝等器官中与排斥、微血管炎症、供者特异性抗体（donor-specific</w:t>
+      </w:r>
+      <w:r>
+        <w:t xml:space="preserve"> antibody, </w:t>
+      </w:r>
+      <w:r>
+        <w:rPr>
+          <w:rFonts w:hint="eastAsia"/>
+        </w:rPr>
+        <w:t xml:space="preserve">DSA）和病理损伤形成关联。现有证据的共同结论并不是“dd-cfDNA</w:t>
+      </w:r>
+      <w:r>
+        <w:t xml:space="preserve"> </w:t>
+      </w:r>
+      <w:r>
+        <w:rPr>
+          <w:rFonts w:hint="eastAsia"/>
+        </w:rPr>
+        <w:t xml:space="preserve">等于排斥”，而是</w:t>
+      </w:r>
+      <w:r>
+        <w:t xml:space="preserve"> dd-cfDNA </w:t>
+      </w:r>
+      <w:r>
+        <w:rPr>
+          <w:rFonts w:hint="eastAsia"/>
+        </w:rPr>
+        <w:t xml:space="preserve">构成了一个跨器官的损伤轴：低位且稳定的结果有助于支持免疫静息或低活检收益，高位、持续升高或相对基线突增则提示需要寻找免疫性、感染性、缺血性或机械性损伤来源。局限也同样明确：dd-cfDNA</w:t>
       </w:r>
       <w:r>
         <w:t xml:space="preserve"> </w:t>
@@ -86,7 +113,7 @@
         <w:rPr>
           <w:rFonts w:hint="eastAsia"/>
         </w:rPr>
-        <w:t xml:space="preserve">细胞介导排斥、缺血再灌注损伤、感染、药物毒性或机械性损伤。未来</w:t>
+        <w:t xml:space="preserve">细胞介导排斥、缺血再灌注损伤、感染、药物毒性、胆汁淤积或近期手术损伤。未来</w:t>
       </w:r>
       <w:r>
         <w:t xml:space="preserve"> 3-5 </w:t>
@@ -122,7 +149,16 @@
         <w:rPr>
           <w:rFonts w:hint="eastAsia"/>
         </w:rPr>
-        <w:t xml:space="preserve">mRNA、转录组、蛋白组、病毒负荷、免疫抑制暴露和机器灌注标志物整合为动态风险模型，用于判断何时活检、何时减免疫、何时强化治疗，以及何时避免过度诊断。</w:t>
+        <w:t xml:space="preserve">mRNA、转录组、蛋白组、病毒负荷、免疫抑制暴露、术前机器灌注标志物和可解释</w:t>
+      </w:r>
+      <w:r>
+        <w:t xml:space="preserve"> AI </w:t>
+      </w:r>
+      <w:r>
+        <w:rPr>
+          <w:rFonts w:hint="eastAsia"/>
+        </w:rPr>
+        <w:t xml:space="preserve">模型整合为动态风险框架，用于判断何时活检、何时减免疫、何时强化治疗，以及何时避免过度诊断。</w:t>
       </w:r>
     </w:p>
     <w:bookmarkEnd w:id="9"/>
@@ -146,34 +182,34 @@
         <w:rPr>
           <w:rFonts w:hint="eastAsia"/>
         </w:rPr>
-        <w:t xml:space="preserve">传统移植监测依赖血清肌酐、肝酶、心功能、肺功能、DSA</w:t>
-      </w:r>
-      <w:r>
-        <w:t xml:space="preserve"> </w:t>
-      </w:r>
-      <w:r>
-        <w:rPr>
-          <w:rFonts w:hint="eastAsia"/>
-        </w:rPr>
-        <w:t xml:space="preserve">和组织活检。问题在于功能指标滞后且不特异，活检有侵入性、采样误差和读片差异，DSA</w:t>
-      </w:r>
-      <w:r>
-        <w:t xml:space="preserve"> </w:t>
-      </w:r>
-      <w:r>
-        <w:rPr>
-          <w:rFonts w:hint="eastAsia"/>
-        </w:rPr>
-        <w:t xml:space="preserve">能提示免疫风险但不能直接量化当前组织损伤。dd-cfDNA</w:t>
-      </w:r>
-      <w:r>
-        <w:t xml:space="preserve"> </w:t>
-      </w:r>
-      <w:r>
-        <w:rPr>
-          <w:rFonts w:hint="eastAsia"/>
-        </w:rPr>
-        <w:t xml:space="preserve">的临床吸引力来自它把移植物细胞死亡转化为外周血可测信号。ADMIRAL</w:t>
+        <w:t xml:space="preserve">传统移植监测依赖血清肌酐、蛋白尿、肝酶、心功能、肺功能、药物浓度、DSA</w:t>
+      </w:r>
+      <w:r>
+        <w:t xml:space="preserve"> </w:t>
+      </w:r>
+      <w:r>
+        <w:rPr>
+          <w:rFonts w:hint="eastAsia"/>
+        </w:rPr>
+        <w:t xml:space="preserve">和组织活检。问题在于这些证据各自只覆盖风险链条的一段：功能指标往往滞后且不特异，DSA</w:t>
+      </w:r>
+      <w:r>
+        <w:t xml:space="preserve"> </w:t>
+      </w:r>
+      <w:r>
+        <w:rPr>
+          <w:rFonts w:hint="eastAsia"/>
+        </w:rPr>
+        <w:t xml:space="preserve">能提示供受者免疫识别和未来风险但不能直接量化当前组织损伤，活检虽然仍是诊断和分型的核心，却存在侵入性、采样误差、病灶异质性和读片差异。dd-cfDNA</w:t>
+      </w:r>
+      <w:r>
+        <w:t xml:space="preserve"> </w:t>
+      </w:r>
+      <w:r>
+        <w:rPr>
+          <w:rFonts w:hint="eastAsia"/>
+        </w:rPr>
+        <w:t xml:space="preserve">的临床吸引力来自它把移植物细胞死亡转化为外周血可重复测量的信号，并且半衰期短，理论上更接近实时损伤状态。ADMIRAL</w:t>
       </w:r>
       <w:r>
         <w:t xml:space="preserve"> </w:t>
@@ -277,6 +313,40 @@
         </w:r>
       </w:hyperlink>
       <w:r>
+        <w:t xml:space="preserve">;</w:t>
+      </w:r>
+      <w:r>
+        <w:t xml:space="preserve"> </w:t>
+      </w:r>
+      <w:hyperlink w:anchor="ref-distinctmolecularprocesses2023">
+        <w:r>
+          <w:rPr>
+            <w:rStyle w:val="Hyperlink"/>
+          </w:rPr>
+          <w:t xml:space="preserve">Gauthier </w:t>
+        </w:r>
+        <w:r>
+          <w:rPr>
+            <w:rStyle w:val="Hyperlink"/>
+            <w:rFonts w:hint="eastAsia"/>
+          </w:rPr>
+          <w:t xml:space="preserve">等</w:t>
+        </w:r>
+        <w:r>
+          <w:rPr>
+            <w:rStyle w:val="Hyperlink"/>
+          </w:rPr>
+          <w:t xml:space="preserve"> </w:t>
+        </w:r>
+        <w:r>
+          <w:rPr>
+            <w:rStyle w:val="Hyperlink"/>
+            <w:rFonts w:hint="eastAsia"/>
+          </w:rPr>
+          <w:t xml:space="preserve">2023年</w:t>
+        </w:r>
+      </w:hyperlink>
+      <w:r>
         <w:t xml:space="preserve">)</w:t>
       </w:r>
       <w:r>
@@ -291,7 +361,152 @@
         <w:rPr>
           <w:rFonts w:hint="eastAsia"/>
         </w:rPr>
-        <w:t xml:space="preserve">近年证据还显示，dd-cfDNA</w:t>
+        <w:t xml:space="preserve">这种定位决定了综述的重点应从“能否诊断排斥”转向“在什么临床上下文中改变决策”。若患者低危、功能稳定、DSA</w:t>
+      </w:r>
+      <w:r>
+        <w:t xml:space="preserve"> </w:t>
+      </w:r>
+      <w:r>
+        <w:rPr>
+          <w:rFonts w:hint="eastAsia"/>
+        </w:rPr>
+        <w:t xml:space="preserve">阴性且</w:t>
+      </w:r>
+      <w:r>
+        <w:t xml:space="preserve"> dd-cfDNA </w:t>
+      </w:r>
+      <w:r>
+        <w:rPr>
+          <w:rFonts w:hint="eastAsia"/>
+        </w:rPr>
+        <w:t xml:space="preserve">长期低位，检测的主要价值是提高排除活动性损伤的把握；若</w:t>
+      </w:r>
+      <w:r>
+        <w:t xml:space="preserve"> DSA </w:t>
+      </w:r>
+      <w:r>
+        <w:rPr>
+          <w:rFonts w:hint="eastAsia"/>
+        </w:rPr>
+        <w:t xml:space="preserve">新发、微血管炎症风险高或既往</w:t>
+      </w:r>
+      <w:r>
+        <w:t xml:space="preserve"> </w:t>
+      </w:r>
+      <w:r>
+        <w:rPr>
+          <w:rFonts w:hint="eastAsia"/>
+        </w:rPr>
+        <w:t xml:space="preserve">ABMR，dd-cfDNA</w:t>
+      </w:r>
+      <w:r>
+        <w:t xml:space="preserve"> </w:t>
+      </w:r>
+      <w:r>
+        <w:rPr>
+          <w:rFonts w:hint="eastAsia"/>
+        </w:rPr>
+        <w:t xml:space="preserve">升高更可能提高活检收益；若同时存在病毒复制、胆道并发症、肺部感染、机械循环支持或近期缺血再灌注，dd-cfDNA</w:t>
+      </w:r>
+      <w:r>
+        <w:t xml:space="preserve"> </w:t>
+      </w:r>
+      <w:r>
+        <w:rPr>
+          <w:rFonts w:hint="eastAsia"/>
+        </w:rPr>
+        <w:t xml:space="preserve">阳性则首先提示需要更宽的病因鉴别。Banff</w:t>
+      </w:r>
+      <w:r>
+        <w:t xml:space="preserve"> </w:t>
+      </w:r>
+      <w:r>
+        <w:rPr>
+          <w:rFonts w:hint="eastAsia"/>
+        </w:rPr>
+        <w:t xml:space="preserve">最小侵入诊断工作组也强调，血液和尿液标志物目前更适合作为组织学和临床判断的辅助，而不是脱离场景的独立诊断工具</w:t>
+      </w:r>
+      <w:r>
+        <w:t xml:space="preserve">(</w:t>
+      </w:r>
+      <w:hyperlink w:anchor="ref-diagnosticpotentialof2022">
+        <w:r>
+          <w:rPr>
+            <w:rStyle w:val="Hyperlink"/>
+          </w:rPr>
+          <w:t xml:space="preserve">Huang, Mengel, </w:t>
+        </w:r>
+        <w:r>
+          <w:rPr>
+            <w:rStyle w:val="Hyperlink"/>
+            <w:rFonts w:hint="eastAsia"/>
+          </w:rPr>
+          <w:t xml:space="preserve">等</w:t>
+        </w:r>
+        <w:r>
+          <w:rPr>
+            <w:rStyle w:val="Hyperlink"/>
+          </w:rPr>
+          <w:t xml:space="preserve"> </w:t>
+        </w:r>
+        <w:r>
+          <w:rPr>
+            <w:rStyle w:val="Hyperlink"/>
+            <w:rFonts w:hint="eastAsia"/>
+          </w:rPr>
+          <w:t xml:space="preserve">2022年</w:t>
+        </w:r>
+      </w:hyperlink>
+      <w:r>
+        <w:t xml:space="preserve">;</w:t>
+      </w:r>
+      <w:r>
+        <w:t xml:space="preserve"> </w:t>
+      </w:r>
+      <w:hyperlink w:anchor="ref-donorderivedcell20251">
+        <w:r>
+          <w:rPr>
+            <w:rStyle w:val="Hyperlink"/>
+          </w:rPr>
+          <w:t xml:space="preserve">Kang </w:t>
+        </w:r>
+        <w:r>
+          <w:rPr>
+            <w:rStyle w:val="Hyperlink"/>
+            <w:rFonts w:hint="eastAsia"/>
+          </w:rPr>
+          <w:t xml:space="preserve">等</w:t>
+        </w:r>
+        <w:r>
+          <w:rPr>
+            <w:rStyle w:val="Hyperlink"/>
+          </w:rPr>
+          <w:t xml:space="preserve"> </w:t>
+        </w:r>
+        <w:r>
+          <w:rPr>
+            <w:rStyle w:val="Hyperlink"/>
+            <w:rFonts w:hint="eastAsia"/>
+          </w:rPr>
+          <w:t xml:space="preserve">2025年</w:t>
+        </w:r>
+      </w:hyperlink>
+      <w:r>
+        <w:t xml:space="preserve">)</w:t>
+      </w:r>
+      <w:r>
+        <w:t xml:space="preserve">。</w:t>
+      </w:r>
+    </w:p>
+    <w:p>
+      <w:pPr>
+        <w:pStyle w:val="BodyText"/>
+      </w:pPr>
+      <w:r>
+        <w:rPr>
+          <w:rFonts w:hint="eastAsia"/>
+        </w:rPr>
+        <w:t xml:space="preserve">近年证据显示，dd-cfDNA</w:t>
       </w:r>
       <w:r>
         <w:t xml:space="preserve"> </w:t>
@@ -408,7 +623,7 @@
         <w:rPr>
           <w:rFonts w:hint="eastAsia"/>
         </w:rPr>
-        <w:t xml:space="preserve">。因此，dd-cfDNA</w:t>
+        <w:t xml:space="preserve">。肾移植的证据最丰富，因而适合讨论证据边界；心移植和肺移植更强调替代频繁侵入性活检和排除高风险事件；肝移植则受到肝细胞体量、再生、胆汁淤积和围手术期释放的影响；多器官移植进一步挑战“一个血浆比例对应一个移植物”的直觉。因此，dd-cfDNA</w:t>
       </w:r>
       <w:r>
         <w:t xml:space="preserve"> </w:t>
@@ -450,7 +665,7 @@
         <w:rPr>
           <w:rFonts w:hint="eastAsia"/>
         </w:rPr>
-        <w:t xml:space="preserve">临床验证最充分的领域。ADMIRAL</w:t>
+        <w:t xml:space="preserve">临床验证最充分的领域，也是最能暴露解释边界的场景。ADMIRAL</w:t>
       </w:r>
       <w:r>
         <w:t xml:space="preserve"> </w:t>
@@ -468,7 +683,65 @@
         <w:rPr>
           <w:rFonts w:hint="eastAsia"/>
         </w:rPr>
-        <w:t xml:space="preserve">纵向升高可与排斥和不良结局相关；一些研究支持把</w:t>
+        <w:t xml:space="preserve">纵向升高可与临床和亚临床排斥、dnDSA</w:t>
+      </w:r>
+      <w:r>
+        <w:t xml:space="preserve"> </w:t>
+      </w:r>
+      <w:r>
+        <w:rPr>
+          <w:rFonts w:hint="eastAsia"/>
+        </w:rPr>
+        <w:t xml:space="preserve">形成以及后续</w:t>
+      </w:r>
+      <w:r>
+        <w:t xml:space="preserve"> eGFR </w:t>
+      </w:r>
+      <w:r>
+        <w:rPr>
+          <w:rFonts w:hint="eastAsia"/>
+        </w:rPr>
+        <w:t xml:space="preserve">下降相关；低位结果则支持移植物静息和低活动性损伤概率</w:t>
+      </w:r>
+      <w:r>
+        <w:t xml:space="preserve">(</w:t>
+      </w:r>
+      <w:hyperlink w:anchor="ref-clinicaloutcomesfrom2021">
+        <w:r>
+          <w:rPr>
+            <w:rStyle w:val="Hyperlink"/>
+          </w:rPr>
+          <w:t xml:space="preserve">Bu </w:t>
+        </w:r>
+        <w:r>
+          <w:rPr>
+            <w:rStyle w:val="Hyperlink"/>
+            <w:rFonts w:hint="eastAsia"/>
+          </w:rPr>
+          <w:t xml:space="preserve">等</w:t>
+        </w:r>
+        <w:r>
+          <w:rPr>
+            <w:rStyle w:val="Hyperlink"/>
+          </w:rPr>
+          <w:t xml:space="preserve"> </w:t>
+        </w:r>
+        <w:r>
+          <w:rPr>
+            <w:rStyle w:val="Hyperlink"/>
+            <w:rFonts w:hint="eastAsia"/>
+          </w:rPr>
+          <w:t xml:space="preserve">2021年</w:t>
+        </w:r>
+      </w:hyperlink>
+      <w:r>
+        <w:t xml:space="preserve">)</w:t>
+      </w:r>
+      <w:r>
+        <w:rPr>
+          <w:rFonts w:hint="eastAsia"/>
+        </w:rPr>
+        <w:t xml:space="preserve">。这一证据使</w:t>
       </w:r>
       <w:r>
         <w:t xml:space="preserve"> dd-cfDNA </w:t>
@@ -477,26 +750,112 @@
         <w:rPr>
           <w:rFonts w:hint="eastAsia"/>
         </w:rPr>
-        <w:t xml:space="preserve">与肌酐、蛋白尿、DSA</w:t>
-      </w:r>
-      <w:r>
-        <w:t xml:space="preserve"> </w:t>
-      </w:r>
-      <w:r>
-        <w:rPr>
-          <w:rFonts w:hint="eastAsia"/>
-        </w:rPr>
-        <w:t xml:space="preserve">和临床事件联合解读，以提高对早期损伤的敏感性</w:t>
+        <w:t xml:space="preserve">适合进入常规随访的风险分层：它可在肌酐尚未明显变化时提示潜在损伤，也可在功能稳定但免疫风险升高的患者中帮助决定是否提前活检。重要的是，这种价值更多来自连续监测和临床整合，而不是某一个跨平台固定阈值。</w:t>
+      </w:r>
+    </w:p>
+    <w:p>
+      <w:pPr>
+        <w:pStyle w:val="BodyText"/>
+      </w:pPr>
+      <w:r>
+        <w:t xml:space="preserve">ABMR </w:t>
+      </w:r>
+      <w:r>
+        <w:rPr>
+          <w:rFonts w:hint="eastAsia"/>
+        </w:rPr>
+        <w:t xml:space="preserve">是肾移植中</w:t>
+      </w:r>
+      <w:r>
+        <w:t xml:space="preserve"> dd-cfDNA </w:t>
+      </w:r>
+      <w:r>
+        <w:rPr>
+          <w:rFonts w:hint="eastAsia"/>
+        </w:rPr>
+        <w:t xml:space="preserve">表现最稳定的应用场景。Trifecta</w:t>
+      </w:r>
+      <w:r>
+        <w:t xml:space="preserve"> </w:t>
+      </w:r>
+      <w:r>
+        <w:rPr>
+          <w:rFonts w:hint="eastAsia"/>
+        </w:rPr>
+        <w:t xml:space="preserve">研究显示，dd-cfDNA</w:t>
+      </w:r>
+      <w:r>
+        <w:t xml:space="preserve"> </w:t>
+      </w:r>
+      <w:r>
+        <w:rPr>
+          <w:rFonts w:hint="eastAsia"/>
+        </w:rPr>
+        <w:t xml:space="preserve">与分子</w:t>
+      </w:r>
+      <w:r>
+        <w:t xml:space="preserve"> </w:t>
+      </w:r>
+      <w:r>
+        <w:rPr>
+          <w:rFonts w:hint="eastAsia"/>
+        </w:rPr>
+        <w:t xml:space="preserve">AMR、微血管炎症和组织损伤关系紧密；即便</w:t>
+      </w:r>
+      <w:r>
+        <w:t xml:space="preserve"> DSA </w:t>
+      </w:r>
+      <w:r>
+        <w:rPr>
+          <w:rFonts w:hint="eastAsia"/>
+        </w:rPr>
+        <w:t xml:space="preserve">阴性，分子或组织学</w:t>
+      </w:r>
+      <w:r>
+        <w:t xml:space="preserve"> AMR </w:t>
+      </w:r>
+      <w:r>
+        <w:rPr>
+          <w:rFonts w:hint="eastAsia"/>
+        </w:rPr>
+        <w:t xml:space="preserve">也可伴随</w:t>
+      </w:r>
+      <w:r>
+        <w:t xml:space="preserve"> dd-cfDNA </w:t>
+      </w:r>
+      <w:r>
+        <w:rPr>
+          <w:rFonts w:hint="eastAsia"/>
+        </w:rPr>
+        <w:t xml:space="preserve">升高，提示</w:t>
+      </w:r>
+      <w:r>
+        <w:t xml:space="preserve"> dd-cfDNA </w:t>
+      </w:r>
+      <w:r>
+        <w:rPr>
+          <w:rFonts w:hint="eastAsia"/>
+        </w:rPr>
+        <w:t xml:space="preserve">能捕捉</w:t>
+      </w:r>
+      <w:r>
+        <w:t xml:space="preserve"> DSA </w:t>
+      </w:r>
+      <w:r>
+        <w:rPr>
+          <w:rFonts w:hint="eastAsia"/>
+        </w:rPr>
+        <w:t xml:space="preserve">未覆盖的损伤后果</w:t>
       </w:r>
       <w:r>
         <w:t xml:space="preserve">(</w:t>
       </w:r>
-      <w:hyperlink w:anchor="ref-clinicaloutcomesfrom2021">
-        <w:r>
-          <w:rPr>
-            <w:rStyle w:val="Hyperlink"/>
-          </w:rPr>
-          <w:t xml:space="preserve">Bu </w:t>
+      <w:hyperlink w:anchor="ref-thetrifectastudy2022">
+        <w:r>
+          <w:rPr>
+            <w:rStyle w:val="Hyperlink"/>
+          </w:rPr>
+          <w:t xml:space="preserve">Halloran, Jeff Reeve, </w:t>
         </w:r>
         <w:r>
           <w:rPr>
@@ -516,21 +875,453 @@
             <w:rStyle w:val="Hyperlink"/>
             <w:rFonts w:hint="eastAsia"/>
           </w:rPr>
+          <w:t xml:space="preserve">2022年</w:t>
+        </w:r>
+      </w:hyperlink>
+      <w:r>
+        <w:t xml:space="preserve">;</w:t>
+      </w:r>
+      <w:r>
+        <w:t xml:space="preserve"> </w:t>
+      </w:r>
+      <w:hyperlink w:anchor="ref-antibodymediatedrejection2022">
+        <w:r>
+          <w:rPr>
+            <w:rStyle w:val="Hyperlink"/>
+          </w:rPr>
+          <w:t xml:space="preserve">Halloran, J. Reeve, Madill-Thomsen, Demko, </w:t>
+        </w:r>
+        <w:r>
+          <w:rPr>
+            <w:rStyle w:val="Hyperlink"/>
+            <w:rFonts w:hint="eastAsia"/>
+          </w:rPr>
+          <w:t xml:space="preserve">等</w:t>
+        </w:r>
+        <w:r>
+          <w:rPr>
+            <w:rStyle w:val="Hyperlink"/>
+          </w:rPr>
+          <w:t xml:space="preserve"> </w:t>
+        </w:r>
+        <w:r>
+          <w:rPr>
+            <w:rStyle w:val="Hyperlink"/>
+            <w:rFonts w:hint="eastAsia"/>
+          </w:rPr>
+          <w:t xml:space="preserve">2022年</w:t>
+        </w:r>
+      </w:hyperlink>
+      <w:r>
+        <w:t xml:space="preserve">)</w:t>
+      </w:r>
+      <w:r>
+        <w:rPr>
+          <w:rFonts w:hint="eastAsia"/>
+        </w:rPr>
+        <w:t xml:space="preserve">。临床研究还显示</w:t>
+      </w:r>
+      <w:r>
+        <w:t xml:space="preserve"> dd-cfDNA </w:t>
+      </w:r>
+      <w:r>
+        <w:rPr>
+          <w:rFonts w:hint="eastAsia"/>
+        </w:rPr>
+        <w:t xml:space="preserve">与</w:t>
+      </w:r>
+      <w:r>
+        <w:t xml:space="preserve"> </w:t>
+      </w:r>
+      <w:r>
+        <w:rPr>
+          <w:rFonts w:hint="eastAsia"/>
+        </w:rPr>
+        <w:t xml:space="preserve">dnDSA、特别是高</w:t>
+      </w:r>
+      <w:r>
+        <w:t xml:space="preserve"> MFI </w:t>
+      </w:r>
+      <w:r>
+        <w:rPr>
+          <w:rFonts w:hint="eastAsia"/>
+        </w:rPr>
+        <w:t xml:space="preserve">或</w:t>
+      </w:r>
+      <w:r>
+        <w:t xml:space="preserve"> class II dnDSA </w:t>
+      </w:r>
+      <w:r>
+        <w:rPr>
+          <w:rFonts w:hint="eastAsia"/>
+        </w:rPr>
+        <w:t xml:space="preserve">联合时，能更好识别晚期同种免疫损伤和</w:t>
+      </w:r>
+      <w:r>
+        <w:t xml:space="preserve"> ABMR/MVI </w:t>
+      </w:r>
+      <w:r>
+        <w:rPr>
+          <w:rFonts w:hint="eastAsia"/>
+        </w:rPr>
+        <w:t xml:space="preserve">风险</w:t>
+      </w:r>
+      <w:r>
+        <w:t xml:space="preserve">(</w:t>
+      </w:r>
+      <w:hyperlink w:anchor="ref-donorderivedcell2022">
+        <w:r>
+          <w:rPr>
+            <w:rStyle w:val="Hyperlink"/>
+          </w:rPr>
+          <w:t xml:space="preserve">Butiu </w:t>
+        </w:r>
+        <w:r>
+          <w:rPr>
+            <w:rStyle w:val="Hyperlink"/>
+            <w:rFonts w:hint="eastAsia"/>
+          </w:rPr>
+          <w:t xml:space="preserve">等</w:t>
+        </w:r>
+        <w:r>
+          <w:rPr>
+            <w:rStyle w:val="Hyperlink"/>
+          </w:rPr>
+          <w:t xml:space="preserve"> </w:t>
+        </w:r>
+        <w:r>
+          <w:rPr>
+            <w:rStyle w:val="Hyperlink"/>
+            <w:rFonts w:hint="eastAsia"/>
+          </w:rPr>
+          <w:t xml:space="preserve">2022年</w:t>
+        </w:r>
+      </w:hyperlink>
+      <w:r>
+        <w:t xml:space="preserve">;</w:t>
+      </w:r>
+      <w:r>
+        <w:t xml:space="preserve"> </w:t>
+      </w:r>
+      <w:hyperlink w:anchor="ref-combiningdonorderived20221">
+        <w:r>
+          <w:rPr>
+            <w:rStyle w:val="Hyperlink"/>
+          </w:rPr>
+          <w:t xml:space="preserve">Obrișcă </w:t>
+        </w:r>
+        <w:r>
+          <w:rPr>
+            <w:rStyle w:val="Hyperlink"/>
+            <w:rFonts w:hint="eastAsia"/>
+          </w:rPr>
+          <w:t xml:space="preserve">等</w:t>
+        </w:r>
+        <w:r>
+          <w:rPr>
+            <w:rStyle w:val="Hyperlink"/>
+          </w:rPr>
+          <w:t xml:space="preserve"> </w:t>
+        </w:r>
+        <w:r>
+          <w:rPr>
+            <w:rStyle w:val="Hyperlink"/>
+            <w:rFonts w:hint="eastAsia"/>
+          </w:rPr>
+          <w:t xml:space="preserve">2022年</w:t>
+        </w:r>
+      </w:hyperlink>
+      <w:r>
+        <w:t xml:space="preserve">;</w:t>
+      </w:r>
+      <w:r>
+        <w:t xml:space="preserve"> </w:t>
+      </w:r>
+      <w:hyperlink w:anchor="ref-donorderivedcell20242">
+        <w:r>
+          <w:rPr>
+            <w:rStyle w:val="Hyperlink"/>
+          </w:rPr>
+          <w:t xml:space="preserve">Kim </w:t>
+        </w:r>
+        <w:r>
+          <w:rPr>
+            <w:rStyle w:val="Hyperlink"/>
+            <w:rFonts w:hint="eastAsia"/>
+          </w:rPr>
+          <w:t xml:space="preserve">等</w:t>
+        </w:r>
+        <w:r>
+          <w:rPr>
+            <w:rStyle w:val="Hyperlink"/>
+          </w:rPr>
+          <w:t xml:space="preserve"> </w:t>
+        </w:r>
+        <w:r>
+          <w:rPr>
+            <w:rStyle w:val="Hyperlink"/>
+            <w:rFonts w:hint="eastAsia"/>
+          </w:rPr>
+          <w:t xml:space="preserve">2024年</w:t>
+        </w:r>
+      </w:hyperlink>
+      <w:r>
+        <w:t xml:space="preserve">)</w:t>
+      </w:r>
+      <w:r>
+        <w:rPr>
+          <w:rFonts w:hint="eastAsia"/>
+        </w:rPr>
+        <w:t xml:space="preserve">。在</w:t>
+      </w:r>
+      <w:r>
+        <w:t xml:space="preserve"> AT1R </w:t>
+      </w:r>
+      <w:r>
+        <w:rPr>
+          <w:rFonts w:hint="eastAsia"/>
+        </w:rPr>
+        <w:t xml:space="preserve">抗体等非</w:t>
+      </w:r>
+      <w:r>
+        <w:t xml:space="preserve"> HLA </w:t>
+      </w:r>
+      <w:r>
+        <w:rPr>
+          <w:rFonts w:hint="eastAsia"/>
+        </w:rPr>
+        <w:t xml:space="preserve">抗体场景中，dd-cfDNA</w:t>
+      </w:r>
+      <w:r>
+        <w:t xml:space="preserve"> </w:t>
+      </w:r>
+      <w:r>
+        <w:rPr>
+          <w:rFonts w:hint="eastAsia"/>
+        </w:rPr>
+        <w:t xml:space="preserve">与</w:t>
+      </w:r>
+      <w:r>
+        <w:t xml:space="preserve"> Banff </w:t>
+      </w:r>
+      <w:r>
+        <w:rPr>
+          <w:rFonts w:hint="eastAsia"/>
+        </w:rPr>
+        <w:t xml:space="preserve">微血管炎症评分的关系也提示它可用于判断抗体存在是否已经转化为组织损伤</w:t>
+      </w:r>
+      <w:r>
+        <w:t xml:space="preserve">(</w:t>
+      </w:r>
+      <w:hyperlink w:anchor="ref-utilityofdonor2021">
+        <w:r>
+          <w:rPr>
+            <w:rStyle w:val="Hyperlink"/>
+          </w:rPr>
+          <w:t xml:space="preserve">Kant </w:t>
+        </w:r>
+        <w:r>
+          <w:rPr>
+            <w:rStyle w:val="Hyperlink"/>
+            <w:rFonts w:hint="eastAsia"/>
+          </w:rPr>
+          <w:t xml:space="preserve">等</w:t>
+        </w:r>
+        <w:r>
+          <w:rPr>
+            <w:rStyle w:val="Hyperlink"/>
+          </w:rPr>
+          <w:t xml:space="preserve"> </w:t>
+        </w:r>
+        <w:r>
+          <w:rPr>
+            <w:rStyle w:val="Hyperlink"/>
+            <w:rFonts w:hint="eastAsia"/>
+          </w:rPr>
           <w:t xml:space="preserve">2021年</w:t>
         </w:r>
       </w:hyperlink>
       <w:r>
+        <w:t xml:space="preserve">)</w:t>
+      </w:r>
+      <w:r>
+        <w:t xml:space="preserve">。</w:t>
+      </w:r>
+    </w:p>
+    <w:p>
+      <w:pPr>
+        <w:pStyle w:val="BodyText"/>
+      </w:pPr>
+      <w:r>
+        <w:rPr>
+          <w:rFonts w:hint="eastAsia"/>
+        </w:rPr>
+        <w:t xml:space="preserve">随机试验的出现使证据边界更清楚。针对已有</w:t>
+      </w:r>
+      <w:r>
+        <w:t xml:space="preserve"> dnDSA </w:t>
+      </w:r>
+      <w:r>
+        <w:rPr>
+          <w:rFonts w:hint="eastAsia"/>
+        </w:rPr>
+        <w:t xml:space="preserve">的肾移植受者，dd-cfDNA</w:t>
+      </w:r>
+      <w:r>
+        <w:t xml:space="preserve"> </w:t>
+      </w:r>
+      <w:r>
+        <w:rPr>
+          <w:rFonts w:hint="eastAsia"/>
+        </w:rPr>
+        <w:t xml:space="preserve">指导活检可缩短</w:t>
+      </w:r>
+      <w:r>
+        <w:t xml:space="preserve"> AMR </w:t>
+      </w:r>
+      <w:r>
+        <w:rPr>
+          <w:rFonts w:hint="eastAsia"/>
+        </w:rPr>
+        <w:t xml:space="preserve">诊断时间，说明它不仅有诊断相关性，也可能改变诊断路径</w:t>
+      </w:r>
+      <w:r>
+        <w:t xml:space="preserve">(</w:t>
+      </w:r>
+      <w:hyperlink w:anchor="ref-donorderivedcell20241">
+        <w:r>
+          <w:rPr>
+            <w:rStyle w:val="Hyperlink"/>
+          </w:rPr>
+          <w:t xml:space="preserve">Akifova, Budde, Amann, </w:t>
+        </w:r>
+        <w:r>
+          <w:rPr>
+            <w:rStyle w:val="Hyperlink"/>
+            <w:rFonts w:hint="eastAsia"/>
+          </w:rPr>
+          <w:t xml:space="preserve">等</w:t>
+        </w:r>
+        <w:r>
+          <w:rPr>
+            <w:rStyle w:val="Hyperlink"/>
+          </w:rPr>
+          <w:t xml:space="preserve"> </w:t>
+        </w:r>
+        <w:r>
+          <w:rPr>
+            <w:rStyle w:val="Hyperlink"/>
+            <w:rFonts w:hint="eastAsia"/>
+          </w:rPr>
+          <w:t xml:space="preserve">2024年</w:t>
+        </w:r>
+      </w:hyperlink>
+      <w:r>
+        <w:t xml:space="preserve">)</w:t>
+      </w:r>
+      <w:r>
+        <w:rPr>
+          <w:rFonts w:hint="eastAsia"/>
+        </w:rPr>
+        <w:t xml:space="preserve">。但是，这并不等于可以把所有</w:t>
+      </w:r>
+      <w:r>
+        <w:t xml:space="preserve"> dd-cfDNA </w:t>
+      </w:r>
+      <w:r>
+        <w:rPr>
+          <w:rFonts w:hint="eastAsia"/>
+        </w:rPr>
+        <w:t xml:space="preserve">升高都直接当作</w:t>
+      </w:r>
+      <w:r>
+        <w:t xml:space="preserve"> AMR </w:t>
+      </w:r>
+      <w:r>
+        <w:rPr>
+          <w:rFonts w:hint="eastAsia"/>
+        </w:rPr>
+        <w:t xml:space="preserve">治疗。TCMR、急性肾损伤、BK</w:t>
+      </w:r>
+      <w:r>
+        <w:t xml:space="preserve"> </w:t>
+      </w:r>
+      <w:r>
+        <w:rPr>
+          <w:rFonts w:hint="eastAsia"/>
+        </w:rPr>
+        <w:t xml:space="preserve">病毒相关肾病、缺血再灌注、钙调神经磷酸酶抑制剂毒性、复发性肾病和近期手术损伤均可能升高</w:t>
+      </w:r>
+      <w:r>
+        <w:t xml:space="preserve"> </w:t>
+      </w:r>
+      <w:r>
+        <w:rPr>
+          <w:rFonts w:hint="eastAsia"/>
+        </w:rPr>
+        <w:t xml:space="preserve">dd-cfDNA；BKPyVAN</w:t>
+      </w:r>
+      <w:r>
+        <w:t xml:space="preserve"> </w:t>
+      </w:r>
+      <w:r>
+        <w:rPr>
+          <w:rFonts w:hint="eastAsia"/>
+        </w:rPr>
+        <w:t xml:space="preserve">还可能同时伴随尿液趋化因子升高，使其与</w:t>
+      </w:r>
+      <w:r>
+        <w:t xml:space="preserve"> TCMR </w:t>
+      </w:r>
+      <w:r>
+        <w:rPr>
+          <w:rFonts w:hint="eastAsia"/>
+        </w:rPr>
+        <w:t xml:space="preserve">的非侵入性模式重叠</w:t>
+      </w:r>
+      <w:r>
+        <w:t xml:space="preserve">(</w:t>
+      </w:r>
+      <w:hyperlink w:anchor="ref-levelsofdonor2022">
+        <w:r>
+          <w:rPr>
+            <w:rStyle w:val="Hyperlink"/>
+          </w:rPr>
+          <w:t xml:space="preserve">Mayer </w:t>
+        </w:r>
+        <w:r>
+          <w:rPr>
+            <w:rStyle w:val="Hyperlink"/>
+            <w:rFonts w:hint="eastAsia"/>
+          </w:rPr>
+          <w:t xml:space="preserve">等</w:t>
+        </w:r>
+        <w:r>
+          <w:rPr>
+            <w:rStyle w:val="Hyperlink"/>
+          </w:rPr>
+          <w:t xml:space="preserve"> </w:t>
+        </w:r>
+        <w:r>
+          <w:rPr>
+            <w:rStyle w:val="Hyperlink"/>
+            <w:rFonts w:hint="eastAsia"/>
+          </w:rPr>
+          <w:t xml:space="preserve">2022年</w:t>
+        </w:r>
+      </w:hyperlink>
+      <w:r>
         <w:t xml:space="preserve">;</w:t>
       </w:r>
       <w:r>
         <w:t xml:space="preserve"> </w:t>
       </w:r>
-      <w:hyperlink w:anchor="ref-clinicalvalidationof2022">
-        <w:r>
-          <w:rPr>
-            <w:rStyle w:val="Hyperlink"/>
-          </w:rPr>
-          <w:t xml:space="preserve">J. P. Rosenheck </w:t>
+      <w:hyperlink w:anchor="ref-diagnosticpotentialof2022">
+        <w:r>
+          <w:rPr>
+            <w:rStyle w:val="Hyperlink"/>
+          </w:rPr>
+          <w:t xml:space="preserve">Huang, Mengel, </w:t>
         </w:r>
         <w:r>
           <w:rPr>
@@ -560,19 +1351,78 @@
         <w:rPr>
           <w:rFonts w:hint="eastAsia"/>
         </w:rPr>
-        <w:t xml:space="preserve">。在抗体介导排斥（ABMR）中，dd-cfDNA</w:t>
-      </w:r>
-      <w:r>
-        <w:t xml:space="preserve"> </w:t>
-      </w:r>
-      <w:r>
-        <w:rPr>
-          <w:rFonts w:hint="eastAsia"/>
-        </w:rPr>
-        <w:t xml:space="preserve">往往比单纯功能指标更接近微血管损伤过程，尤其当</w:t>
-      </w:r>
-      <w:r>
-        <w:t xml:space="preserve"> DSA </w:t>
+        <w:t xml:space="preserve">。因此，肾移植中的合理策略是把</w:t>
+      </w:r>
+      <w:r>
+        <w:t xml:space="preserve"> dd-cfDNA </w:t>
+      </w:r>
+      <w:r>
+        <w:rPr>
+          <w:rFonts w:hint="eastAsia"/>
+        </w:rPr>
+        <w:t xml:space="preserve">用作“是否存在实质损伤”和“是否提高活检收益”的证据，而不是单独完成病因分型。</w:t>
+      </w:r>
+    </w:p>
+    <w:p>
+      <w:pPr>
+        <w:pStyle w:val="BodyText"/>
+      </w:pPr>
+      <w:r>
+        <w:t xml:space="preserve">fraction </w:t>
+      </w:r>
+      <w:r>
+        <w:rPr>
+          <w:rFonts w:hint="eastAsia"/>
+        </w:rPr>
+        <w:t xml:space="preserve">与</w:t>
+      </w:r>
+      <w:r>
+        <w:t xml:space="preserve"> absolute quantity </w:t>
+      </w:r>
+      <w:r>
+        <w:rPr>
+          <w:rFonts w:hint="eastAsia"/>
+        </w:rPr>
+        <w:t xml:space="preserve">是肾移植解释中最重要的技术边界之一。fraction</w:t>
+      </w:r>
+      <w:r>
+        <w:t xml:space="preserve"> </w:t>
+      </w:r>
+      <w:r>
+        <w:rPr>
+          <w:rFonts w:hint="eastAsia"/>
+        </w:rPr>
+        <w:t xml:space="preserve">反映供者</w:t>
+      </w:r>
+      <w:r>
+        <w:t xml:space="preserve"> cfDNA </w:t>
+      </w:r>
+      <w:r>
+        <w:rPr>
+          <w:rFonts w:hint="eastAsia"/>
+        </w:rPr>
+        <w:t xml:space="preserve">占总</w:t>
+      </w:r>
+      <w:r>
+        <w:t xml:space="preserve"> cfDNA </w:t>
+      </w:r>
+      <w:r>
+        <w:rPr>
+          <w:rFonts w:hint="eastAsia"/>
+        </w:rPr>
+        <w:t xml:space="preserve">的比例，便于跨样本理解，但会受受者总</w:t>
+      </w:r>
+      <w:r>
+        <w:t xml:space="preserve"> cfDNA </w:t>
+      </w:r>
+      <w:r>
+        <w:rPr>
+          <w:rFonts w:hint="eastAsia"/>
+        </w:rPr>
+        <w:t xml:space="preserve">背景影响；手术、炎症、感染、肥胖、白细胞释放或其他系统性损伤可使分母升高，从而把真实供者释放“稀释”成较低比例。absolute</w:t>
+      </w:r>
+      <w:r>
+        <w:t xml:space="preserve"> quantity </w:t>
       </w:r>
       <w:r>
         <w:rPr>
@@ -581,23 +1431,59 @@
         <w:t xml:space="preserve">或</w:t>
       </w:r>
       <w:r>
-        <w:t xml:space="preserve"> AT1R </w:t>
-      </w:r>
-      <w:r>
-        <w:rPr>
-          <w:rFonts w:hint="eastAsia"/>
-        </w:rPr>
-        <w:t xml:space="preserve">抗体提示免疫风险时更有解释力</w:t>
+        <w:t xml:space="preserve"> copies/mL </w:t>
+      </w:r>
+      <w:r>
+        <w:rPr>
+          <w:rFonts w:hint="eastAsia"/>
+        </w:rPr>
+        <w:t xml:space="preserve">试图直接量化供者来源拷贝数，可在高总</w:t>
+      </w:r>
+      <w:r>
+        <w:t xml:space="preserve"> cfDNA </w:t>
+      </w:r>
+      <w:r>
+        <w:rPr>
+          <w:rFonts w:hint="eastAsia"/>
+        </w:rPr>
+        <w:t xml:space="preserve">背景下补充分数值的假阴性风险。Trifecta</w:t>
+      </w:r>
+      <w:r>
+        <w:t xml:space="preserve"> </w:t>
+      </w:r>
+      <w:r>
+        <w:rPr>
+          <w:rFonts w:hint="eastAsia"/>
+        </w:rPr>
+        <w:t xml:space="preserve">相关分析和后续队列均支持同时使用</w:t>
+      </w:r>
+      <w:r>
+        <w:t xml:space="preserve"> fraction </w:t>
+      </w:r>
+      <w:r>
+        <w:rPr>
+          <w:rFonts w:hint="eastAsia"/>
+        </w:rPr>
+        <w:t xml:space="preserve">与</w:t>
+      </w:r>
+      <w:r>
+        <w:t xml:space="preserve"> quantity </w:t>
+      </w:r>
+      <w:r>
+        <w:rPr>
+          <w:rFonts w:hint="eastAsia"/>
+        </w:rPr>
+        <w:t xml:space="preserve">或连续复合评分，以提高对活动性排斥的识别能力</w:t>
       </w:r>
       <w:r>
         <w:t xml:space="preserve">(</w:t>
       </w:r>
-      <w:hyperlink w:anchor="ref-utilityofdonor2021">
-        <w:r>
-          <w:rPr>
-            <w:rStyle w:val="Hyperlink"/>
-          </w:rPr>
-          <w:t xml:space="preserve">Kant </w:t>
+      <w:hyperlink w:anchor="ref-usingboththe2021">
+        <w:r>
+          <w:rPr>
+            <w:rStyle w:val="Hyperlink"/>
+          </w:rPr>
+          <w:t xml:space="preserve">Bunnapradist, Homkrailas, </w:t>
         </w:r>
         <w:r>
           <w:rPr>
@@ -626,12 +1512,12 @@
       <w:r>
         <w:t xml:space="preserve"> </w:t>
       </w:r>
-      <w:hyperlink w:anchor="ref-donorderivedcell20241">
-        <w:r>
-          <w:rPr>
-            <w:rStyle w:val="Hyperlink"/>
-          </w:rPr>
-          <w:t xml:space="preserve">Akifova, Budde, Amann, </w:t>
+      <w:hyperlink w:anchor="ref-combiningdonorderived2022">
+        <w:r>
+          <w:rPr>
+            <w:rStyle w:val="Hyperlink"/>
+          </w:rPr>
+          <w:t xml:space="preserve">Halloran, J. Reeve, Madill-Thomsen, Kaur, </w:t>
         </w:r>
         <w:r>
           <w:rPr>
@@ -651,43 +1537,143 @@
             <w:rStyle w:val="Hyperlink"/>
             <w:rFonts w:hint="eastAsia"/>
           </w:rPr>
-          <w:t xml:space="preserve">2024年</w:t>
+          <w:t xml:space="preserve">2022年</w:t>
+        </w:r>
+      </w:hyperlink>
+      <w:r>
+        <w:t xml:space="preserve">;</w:t>
+      </w:r>
+      <w:r>
+        <w:t xml:space="preserve"> </w:t>
+      </w:r>
+      <w:hyperlink w:anchor="ref-improvingdiagnosticperformance2025">
+        <w:r>
+          <w:rPr>
+            <w:rStyle w:val="Hyperlink"/>
+          </w:rPr>
+          <w:t xml:space="preserve">Benning </w:t>
+        </w:r>
+        <w:r>
+          <w:rPr>
+            <w:rStyle w:val="Hyperlink"/>
+            <w:rFonts w:hint="eastAsia"/>
+          </w:rPr>
+          <w:t xml:space="preserve">等</w:t>
+        </w:r>
+        <w:r>
+          <w:rPr>
+            <w:rStyle w:val="Hyperlink"/>
+          </w:rPr>
+          <w:t xml:space="preserve"> </w:t>
+        </w:r>
+        <w:r>
+          <w:rPr>
+            <w:rStyle w:val="Hyperlink"/>
+            <w:rFonts w:hint="eastAsia"/>
+          </w:rPr>
+          <w:t xml:space="preserve">2025年</w:t>
         </w:r>
       </w:hyperlink>
       <w:r>
         <w:t xml:space="preserve">)</w:t>
       </w:r>
       <w:r>
-        <w:t xml:space="preserve">。</w:t>
-      </w:r>
-    </w:p>
-    <w:p>
-      <w:pPr>
-        <w:pStyle w:val="BodyText"/>
-      </w:pPr>
-      <w:r>
-        <w:rPr>
-          <w:rFonts w:hint="eastAsia"/>
-        </w:rPr>
-        <w:t xml:space="preserve">肾移植的经验也提醒我们不能过度承诺。dd-cfDNA</w:t>
-      </w:r>
-      <w:r>
-        <w:t xml:space="preserve"> </w:t>
-      </w:r>
-      <w:r>
-        <w:rPr>
-          <w:rFonts w:hint="eastAsia"/>
-        </w:rPr>
-        <w:t xml:space="preserve">升高可见于感染、BK</w:t>
-      </w:r>
-      <w:r>
-        <w:t xml:space="preserve"> </w:t>
-      </w:r>
-      <w:r>
-        <w:rPr>
-          <w:rFonts w:hint="eastAsia"/>
-        </w:rPr>
-        <w:t xml:space="preserve">病毒相关损伤、缺血再灌注、钙调神经磷酸酶抑制剂毒性、复发性肾病和近期手术损伤。分数阈值在不同平台、不同人群和不同时间点之间并非完全可移植。分数比例还可能受受者总</w:t>
+        <w:rPr>
+          <w:rFonts w:hint="eastAsia"/>
+        </w:rPr>
+        <w:t xml:space="preserve">。不过绝对量也受采血、保存、提取、UMI</w:t>
+      </w:r>
+      <w:r>
+        <w:t xml:space="preserve"> </w:t>
+      </w:r>
+      <w:r>
+        <w:rPr>
+          <w:rFonts w:hint="eastAsia"/>
+        </w:rPr>
+        <w:t xml:space="preserve">计数和平台校准影响；不同方法之间百分比可高度相关，绝对拷贝数仍可能存在比例偏倚</w:t>
+      </w:r>
+      <w:r>
+        <w:t xml:space="preserve">(</w:t>
+      </w:r>
+      <w:hyperlink w:anchor="ref-comparisonofmethods2023">
+        <w:r>
+          <w:rPr>
+            <w:rStyle w:val="Hyperlink"/>
+          </w:rPr>
+          <w:t xml:space="preserve">Kueng </w:t>
+        </w:r>
+        <w:r>
+          <w:rPr>
+            <w:rStyle w:val="Hyperlink"/>
+            <w:rFonts w:hint="eastAsia"/>
+          </w:rPr>
+          <w:t xml:space="preserve">等</w:t>
+        </w:r>
+        <w:r>
+          <w:rPr>
+            <w:rStyle w:val="Hyperlink"/>
+          </w:rPr>
+          <w:t xml:space="preserve"> </w:t>
+        </w:r>
+        <w:r>
+          <w:rPr>
+            <w:rStyle w:val="Hyperlink"/>
+            <w:rFonts w:hint="eastAsia"/>
+          </w:rPr>
+          <w:t xml:space="preserve">2023年</w:t>
+        </w:r>
+      </w:hyperlink>
+      <w:r>
+        <w:t xml:space="preserve">;</w:t>
+      </w:r>
+      <w:r>
+        <w:t xml:space="preserve"> </w:t>
+      </w:r>
+      <w:hyperlink w:anchor="ref-dropletdigitalpcr2023">
+        <w:r>
+          <w:rPr>
+            <w:rStyle w:val="Hyperlink"/>
+          </w:rPr>
+          <w:t xml:space="preserve">Clausen </w:t>
+        </w:r>
+        <w:r>
+          <w:rPr>
+            <w:rStyle w:val="Hyperlink"/>
+            <w:rFonts w:hint="eastAsia"/>
+          </w:rPr>
+          <w:t xml:space="preserve">等</w:t>
+        </w:r>
+        <w:r>
+          <w:rPr>
+            <w:rStyle w:val="Hyperlink"/>
+          </w:rPr>
+          <w:t xml:space="preserve"> </w:t>
+        </w:r>
+        <w:r>
+          <w:rPr>
+            <w:rStyle w:val="Hyperlink"/>
+            <w:rFonts w:hint="eastAsia"/>
+          </w:rPr>
+          <w:t xml:space="preserve">2023年</w:t>
+        </w:r>
+      </w:hyperlink>
+      <w:r>
+        <w:t xml:space="preserve">)</w:t>
+      </w:r>
+      <w:r>
+        <w:rPr>
+          <w:rFonts w:hint="eastAsia"/>
+        </w:rPr>
+        <w:t xml:space="preserve">。因此，报告系统最好同时给出</w:t>
+      </w:r>
+      <w:r>
+        <w:t xml:space="preserve"> fraction、absolute </w:t>
+      </w:r>
+      <w:r>
+        <w:rPr>
+          <w:rFonts w:hint="eastAsia"/>
+        </w:rPr>
+        <w:t xml:space="preserve">quantity、总</w:t>
       </w:r>
       <w:r>
         <w:t xml:space="preserve"> cfDNA </w:t>
@@ -696,65 +1682,7 @@
         <w:rPr>
           <w:rFonts w:hint="eastAsia"/>
         </w:rPr>
-        <w:t xml:space="preserve">背景影响；部分研究因此同时讨论</w:t>
-      </w:r>
-      <w:r>
-        <w:t xml:space="preserve"> fraction </w:t>
-      </w:r>
-      <w:r>
-        <w:rPr>
-          <w:rFonts w:hint="eastAsia"/>
-        </w:rPr>
-        <w:t xml:space="preserve">与</w:t>
-      </w:r>
-      <w:r>
-        <w:t xml:space="preserve"> absolute quantity </w:t>
-      </w:r>
-      <w:r>
-        <w:rPr>
-          <w:rFonts w:hint="eastAsia"/>
-        </w:rPr>
-        <w:t xml:space="preserve">的价值</w:t>
-      </w:r>
-      <w:r>
-        <w:t xml:space="preserve">(</w:t>
-      </w:r>
-      <w:hyperlink w:anchor="ref-whycellfree2022">
-        <w:r>
-          <w:rPr>
-            <w:rStyle w:val="Hyperlink"/>
-          </w:rPr>
-          <w:t xml:space="preserve">J. Rosenheck </w:t>
-        </w:r>
-        <w:r>
-          <w:rPr>
-            <w:rStyle w:val="Hyperlink"/>
-            <w:rFonts w:hint="eastAsia"/>
-          </w:rPr>
-          <w:t xml:space="preserve">等</w:t>
-        </w:r>
-        <w:r>
-          <w:rPr>
-            <w:rStyle w:val="Hyperlink"/>
-          </w:rPr>
-          <w:t xml:space="preserve"> </w:t>
-        </w:r>
-        <w:r>
-          <w:rPr>
-            <w:rStyle w:val="Hyperlink"/>
-            <w:rFonts w:hint="eastAsia"/>
-          </w:rPr>
-          <w:t xml:space="preserve">2022年</w:t>
-        </w:r>
-      </w:hyperlink>
-      <w:r>
-        <w:t xml:space="preserve">)</w:t>
-      </w:r>
-      <w:r>
-        <w:rPr>
-          <w:rFonts w:hint="eastAsia"/>
-        </w:rPr>
-        <w:t xml:space="preserve">。未来模型若只输出“阳性/阴性”，很难服务复杂门诊决策；更合理的输出应包括时间趋势、个体基线偏离，以及与其他证据的一致性。</w:t>
+        <w:t xml:space="preserve">背景、个体化基线和相对变化，而不是只给一个“阳性/阴性”。</w:t>
       </w:r>
     </w:p>
     <w:bookmarkEnd w:id="11"/>
@@ -778,25 +1706,34 @@
         <w:rPr>
           <w:rFonts w:hint="eastAsia"/>
         </w:rPr>
-        <w:t xml:space="preserve">心移植长期依赖心内膜活检，但活检频繁、侵入性强且对局灶病变敏感性有限。dd-cfDNA</w:t>
-      </w:r>
-      <w:r>
-        <w:t xml:space="preserve"> </w:t>
-      </w:r>
-      <w:r>
-        <w:rPr>
-          <w:rFonts w:hint="eastAsia"/>
-        </w:rPr>
-        <w:t xml:space="preserve">在心移植中可与急性排斥、移植物损伤和</w:t>
-      </w:r>
-      <w:r>
-        <w:t xml:space="preserve"> DSA/ABMR </w:t>
-      </w:r>
-      <w:r>
-        <w:rPr>
-          <w:rFonts w:hint="eastAsia"/>
-        </w:rPr>
-        <w:t xml:space="preserve">风险形成关联；近期研究也开始比较</w:t>
+        <w:t xml:space="preserve">心移植长期依赖心内膜活检，但活检频繁、侵入性强，且对局灶病变和读片一致性存在限制。dd-cfDNA</w:t>
+      </w:r>
+      <w:r>
+        <w:t xml:space="preserve"> </w:t>
+      </w:r>
+      <w:r>
+        <w:rPr>
+          <w:rFonts w:hint="eastAsia"/>
+        </w:rPr>
+        <w:t xml:space="preserve">在心移植中的直接吸引力，是减少低收益监测活检并更早识别</w:t>
+      </w:r>
+      <w:r>
+        <w:t xml:space="preserve"> ABMR </w:t>
+      </w:r>
+      <w:r>
+        <w:rPr>
+          <w:rFonts w:hint="eastAsia"/>
+        </w:rPr>
+        <w:t xml:space="preserve">或移植物损伤。Trifecta-Heart</w:t>
+      </w:r>
+      <w:r>
+        <w:t xml:space="preserve"> </w:t>
+      </w:r>
+      <w:r>
+        <w:rPr>
+          <w:rFonts w:hint="eastAsia"/>
+        </w:rPr>
+        <w:t xml:space="preserve">研究显示，血浆</w:t>
       </w:r>
       <w:r>
         <w:t xml:space="preserve"> dd-cfDNA </w:t>
@@ -805,16 +1742,7 @@
         <w:rPr>
           <w:rFonts w:hint="eastAsia"/>
         </w:rPr>
-        <w:t xml:space="preserve">与心肌活检基因表达、线粒体</w:t>
-      </w:r>
-      <w:r>
-        <w:t xml:space="preserve"> DNA </w:t>
-      </w:r>
-      <w:r>
-        <w:rPr>
-          <w:rFonts w:hint="eastAsia"/>
-        </w:rPr>
-        <w:t xml:space="preserve">和人群差异之间的关系</w:t>
+        <w:t xml:space="preserve">不仅与分子排斥通路相关，也与损伤和巨噬细胞浸润相关，说明心肌细胞损伤本身可形成强烈炎症背景</w:t>
       </w:r>
       <w:r>
         <w:t xml:space="preserve">(</w:t>
@@ -848,11 +1776,357 @@
         </w:r>
       </w:hyperlink>
       <w:r>
+        <w:t xml:space="preserve">)</w:t>
+      </w:r>
+      <w:r>
+        <w:rPr>
+          <w:rFonts w:hint="eastAsia"/>
+        </w:rPr>
+        <w:t xml:space="preserve">。前瞻性多测试研究进一步显示，分子</w:t>
+      </w:r>
+      <w:r>
+        <w:t xml:space="preserve"> ABMR </w:t>
+      </w:r>
+      <w:r>
+        <w:rPr>
+          <w:rFonts w:hint="eastAsia"/>
+        </w:rPr>
+        <w:t xml:space="preserve">与</w:t>
+      </w:r>
+      <w:r>
+        <w:t xml:space="preserve"> dd-cfDNA、DSA </w:t>
+      </w:r>
+      <w:r>
+        <w:rPr>
+          <w:rFonts w:hint="eastAsia"/>
+        </w:rPr>
+        <w:t xml:space="preserve">的关系强于传统组织学</w:t>
+      </w:r>
+      <w:r>
+        <w:t xml:space="preserve"> </w:t>
+      </w:r>
+      <w:r>
+        <w:rPr>
+          <w:rFonts w:hint="eastAsia"/>
+        </w:rPr>
+        <w:t xml:space="preserve">ABMR；当组织学、分子诊断、DSA</w:t>
+      </w:r>
+      <w:r>
+        <w:t xml:space="preserve"> </w:t>
+      </w:r>
+      <w:r>
+        <w:rPr>
+          <w:rFonts w:hint="eastAsia"/>
+        </w:rPr>
+        <w:t xml:space="preserve">和</w:t>
+      </w:r>
+      <w:r>
+        <w:t xml:space="preserve"> dd-cfDNA </w:t>
+      </w:r>
+      <w:r>
+        <w:rPr>
+          <w:rFonts w:hint="eastAsia"/>
+        </w:rPr>
+        <w:t xml:space="preserve">不一致时，dd-cfDNA</w:t>
+      </w:r>
+      <w:r>
+        <w:t xml:space="preserve"> </w:t>
+      </w:r>
+      <w:r>
+        <w:rPr>
+          <w:rFonts w:hint="eastAsia"/>
+        </w:rPr>
+        <w:t xml:space="preserve">可帮助判断哪一组证据更接近当前损伤状态</w:t>
+      </w:r>
+      <w:r>
+        <w:t xml:space="preserve">(</w:t>
+      </w:r>
+      <w:hyperlink w:anchor="ref-definingtherelationships2025">
+        <w:r>
+          <w:rPr>
+            <w:rStyle w:val="Hyperlink"/>
+          </w:rPr>
+          <w:t xml:space="preserve">Madill-Thomsen </w:t>
+        </w:r>
+        <w:r>
+          <w:rPr>
+            <w:rStyle w:val="Hyperlink"/>
+            <w:rFonts w:hint="eastAsia"/>
+          </w:rPr>
+          <w:t xml:space="preserve">等</w:t>
+        </w:r>
+        <w:r>
+          <w:rPr>
+            <w:rStyle w:val="Hyperlink"/>
+          </w:rPr>
+          <w:t xml:space="preserve"> </w:t>
+        </w:r>
+        <w:r>
+          <w:rPr>
+            <w:rStyle w:val="Hyperlink"/>
+            <w:rFonts w:hint="eastAsia"/>
+          </w:rPr>
+          <w:t xml:space="preserve">2025年</w:t>
+        </w:r>
+      </w:hyperlink>
+      <w:r>
+        <w:t xml:space="preserve">)</w:t>
+      </w:r>
+      <w:r>
+        <w:t xml:space="preserve">。</w:t>
+      </w:r>
+    </w:p>
+    <w:p>
+      <w:pPr>
+        <w:pStyle w:val="BodyText"/>
+      </w:pPr>
+      <w:r>
+        <w:rPr>
+          <w:rFonts w:hint="eastAsia"/>
+        </w:rPr>
+        <w:t xml:space="preserve">心移植的临床解释更依赖“前测概率”。在</w:t>
+      </w:r>
+      <w:r>
+        <w:t xml:space="preserve"> DSA </w:t>
+      </w:r>
+      <w:r>
+        <w:rPr>
+          <w:rFonts w:hint="eastAsia"/>
+        </w:rPr>
+        <w:t xml:space="preserve">阴性、心功能稳定的患者中，低</w:t>
+      </w:r>
+      <w:r>
+        <w:t xml:space="preserve"> dd-cfDNA </w:t>
+      </w:r>
+      <w:r>
+        <w:rPr>
+          <w:rFonts w:hint="eastAsia"/>
+        </w:rPr>
+        <w:t xml:space="preserve">更适合排除高风险事件；在</w:t>
+      </w:r>
+      <w:r>
+        <w:t xml:space="preserve"> DSA </w:t>
+      </w:r>
+      <w:r>
+        <w:rPr>
+          <w:rFonts w:hint="eastAsia"/>
+        </w:rPr>
+        <w:t xml:space="preserve">阳性、左室功能下降或疑似</w:t>
+      </w:r>
+      <w:r>
+        <w:t xml:space="preserve"> AMR </w:t>
+      </w:r>
+      <w:r>
+        <w:rPr>
+          <w:rFonts w:hint="eastAsia"/>
+        </w:rPr>
+        <w:t xml:space="preserve">患者中，同样的</w:t>
+      </w:r>
+      <w:r>
+        <w:t xml:space="preserve"> dd-cfDNA </w:t>
+      </w:r>
+      <w:r>
+        <w:rPr>
+          <w:rFonts w:hint="eastAsia"/>
+        </w:rPr>
+        <w:t xml:space="preserve">升高会显著提高活检和治疗评估的价值</w:t>
+      </w:r>
+      <w:r>
+        <w:t xml:space="preserve">(</w:t>
+      </w:r>
+      <w:hyperlink w:anchor="ref-redefiningcardiacantibody2024">
+        <w:r>
+          <w:rPr>
+            <w:rStyle w:val="Hyperlink"/>
+          </w:rPr>
+          <w:t xml:space="preserve">Goldberg </w:t>
+        </w:r>
+        <w:r>
+          <w:rPr>
+            <w:rStyle w:val="Hyperlink"/>
+            <w:rFonts w:hint="eastAsia"/>
+          </w:rPr>
+          <w:t xml:space="preserve">等</w:t>
+        </w:r>
+        <w:r>
+          <w:rPr>
+            <w:rStyle w:val="Hyperlink"/>
+          </w:rPr>
+          <w:t xml:space="preserve"> </w:t>
+        </w:r>
+        <w:r>
+          <w:rPr>
+            <w:rStyle w:val="Hyperlink"/>
+            <w:rFonts w:hint="eastAsia"/>
+          </w:rPr>
+          <w:t xml:space="preserve">2024年</w:t>
+        </w:r>
+      </w:hyperlink>
+      <w:r>
         <w:t xml:space="preserve">;</w:t>
       </w:r>
       <w:r>
         <w:t xml:space="preserve"> </w:t>
       </w:r>
+      <w:hyperlink w:anchor="ref-donorderivedcell20253">
+        <w:r>
+          <w:rPr>
+            <w:rStyle w:val="Hyperlink"/>
+          </w:rPr>
+          <w:t xml:space="preserve">Kim </w:t>
+        </w:r>
+        <w:r>
+          <w:rPr>
+            <w:rStyle w:val="Hyperlink"/>
+            <w:rFonts w:hint="eastAsia"/>
+          </w:rPr>
+          <w:t xml:space="preserve">等</w:t>
+        </w:r>
+        <w:r>
+          <w:rPr>
+            <w:rStyle w:val="Hyperlink"/>
+          </w:rPr>
+          <w:t xml:space="preserve"> </w:t>
+        </w:r>
+        <w:r>
+          <w:rPr>
+            <w:rStyle w:val="Hyperlink"/>
+            <w:rFonts w:hint="eastAsia"/>
+          </w:rPr>
+          <w:t xml:space="preserve">2025年</w:t>
+        </w:r>
+      </w:hyperlink>
+      <w:r>
+        <w:t xml:space="preserve">)</w:t>
+      </w:r>
+      <w:r>
+        <w:rPr>
+          <w:rFonts w:hint="eastAsia"/>
+        </w:rPr>
+        <w:t xml:space="preserve">。单中心实践提示，以</w:t>
+      </w:r>
+      <w:r>
+        <w:t xml:space="preserve"> dd-cfDNA </w:t>
+      </w:r>
+      <w:r>
+        <w:rPr>
+          <w:rFonts w:hint="eastAsia"/>
+        </w:rPr>
+        <w:t xml:space="preserve">为核心的现代监测路径可能减少心内膜活检数量且不增加短期不良结局，但也可能识别更多</w:t>
+      </w:r>
+      <w:r>
+        <w:t xml:space="preserve"> AMR </w:t>
+      </w:r>
+      <w:r>
+        <w:rPr>
+          <w:rFonts w:hint="eastAsia"/>
+        </w:rPr>
+        <w:t xml:space="preserve">相关信号，需要避免把每一次低度升高都转化为治疗</w:t>
+      </w:r>
+      <w:r>
+        <w:t xml:space="preserve">(</w:t>
+      </w:r>
+      <w:hyperlink w:anchor="ref-amodernheart2024">
+        <w:r>
+          <w:rPr>
+            <w:rStyle w:val="Hyperlink"/>
+          </w:rPr>
+          <w:t xml:space="preserve">Saeyeldin </w:t>
+        </w:r>
+        <w:r>
+          <w:rPr>
+            <w:rStyle w:val="Hyperlink"/>
+            <w:rFonts w:hint="eastAsia"/>
+          </w:rPr>
+          <w:t xml:space="preserve">等</w:t>
+        </w:r>
+        <w:r>
+          <w:rPr>
+            <w:rStyle w:val="Hyperlink"/>
+          </w:rPr>
+          <w:t xml:space="preserve"> </w:t>
+        </w:r>
+        <w:r>
+          <w:rPr>
+            <w:rStyle w:val="Hyperlink"/>
+            <w:rFonts w:hint="eastAsia"/>
+          </w:rPr>
+          <w:t xml:space="preserve">2024年</w:t>
+        </w:r>
+      </w:hyperlink>
+      <w:r>
+        <w:t xml:space="preserve">;</w:t>
+      </w:r>
+      <w:r>
+        <w:t xml:space="preserve"> </w:t>
+      </w:r>
+      <w:hyperlink w:anchor="ref-initiationofnoninvasive2021">
+        <w:r>
+          <w:rPr>
+            <w:rStyle w:val="Hyperlink"/>
+          </w:rPr>
+          <w:t xml:space="preserve">Kewcharoen </w:t>
+        </w:r>
+        <w:r>
+          <w:rPr>
+            <w:rStyle w:val="Hyperlink"/>
+            <w:rFonts w:hint="eastAsia"/>
+          </w:rPr>
+          <w:t xml:space="preserve">等</w:t>
+        </w:r>
+        <w:r>
+          <w:rPr>
+            <w:rStyle w:val="Hyperlink"/>
+          </w:rPr>
+          <w:t xml:space="preserve"> </w:t>
+        </w:r>
+        <w:r>
+          <w:rPr>
+            <w:rStyle w:val="Hyperlink"/>
+            <w:rFonts w:hint="eastAsia"/>
+          </w:rPr>
+          <w:t xml:space="preserve">2021年</w:t>
+        </w:r>
+      </w:hyperlink>
+      <w:r>
+        <w:t xml:space="preserve">)</w:t>
+      </w:r>
+      <w:r>
+        <w:rPr>
+          <w:rFonts w:hint="eastAsia"/>
+        </w:rPr>
+        <w:t xml:space="preserve">。心衰、感染、缺血损伤、机械循环支持和人群差异会改变</w:t>
+      </w:r>
+      <w:r>
+        <w:t xml:space="preserve"> cfDNA </w:t>
+      </w:r>
+      <w:r>
+        <w:rPr>
+          <w:rFonts w:hint="eastAsia"/>
+        </w:rPr>
+        <w:t xml:space="preserve">背景；因此，心移植中的</w:t>
+      </w:r>
+      <w:r>
+        <w:t xml:space="preserve"> dd-cfDNA </w:t>
+      </w:r>
+      <w:r>
+        <w:rPr>
+          <w:rFonts w:hint="eastAsia"/>
+        </w:rPr>
+        <w:t xml:space="preserve">应和</w:t>
+      </w:r>
+      <w:r>
+        <w:t xml:space="preserve"> </w:t>
+      </w:r>
+      <w:r>
+        <w:rPr>
+          <w:rFonts w:hint="eastAsia"/>
+        </w:rPr>
+        <w:t xml:space="preserve">GEP、DSA、超声/磁共振、肌钙蛋白、临床症状和活检结果共同解释</w:t>
+      </w:r>
+      <w:r>
+        <w:t xml:space="preserve">(</w:t>
+      </w:r>
       <w:hyperlink w:anchor="ref-racialdifferencesin2024">
         <w:r>
           <w:rPr>
@@ -887,7 +2161,579 @@
       <w:r>
         <w:t xml:space="preserve"> </w:t>
       </w:r>
-      <w:hyperlink w:anchor="ref-significanceofelevated2025">
+      <w:hyperlink w:anchor="ref-europeansocietyfor2024">
+        <w:r>
+          <w:rPr>
+            <w:rStyle w:val="Hyperlink"/>
+          </w:rPr>
+          <w:t xml:space="preserve">Nikolova </w:t>
+        </w:r>
+        <w:r>
+          <w:rPr>
+            <w:rStyle w:val="Hyperlink"/>
+            <w:rFonts w:hint="eastAsia"/>
+          </w:rPr>
+          <w:t xml:space="preserve">等</w:t>
+        </w:r>
+        <w:r>
+          <w:rPr>
+            <w:rStyle w:val="Hyperlink"/>
+          </w:rPr>
+          <w:t xml:space="preserve"> </w:t>
+        </w:r>
+        <w:r>
+          <w:rPr>
+            <w:rStyle w:val="Hyperlink"/>
+            <w:rFonts w:hint="eastAsia"/>
+          </w:rPr>
+          <w:t xml:space="preserve">2024年</w:t>
+        </w:r>
+      </w:hyperlink>
+      <w:r>
+        <w:t xml:space="preserve">)</w:t>
+      </w:r>
+      <w:r>
+        <w:t xml:space="preserve">。</w:t>
+      </w:r>
+    </w:p>
+    <w:p>
+      <w:pPr>
+        <w:pStyle w:val="BodyText"/>
+      </w:pPr>
+      <w:r>
+        <w:rPr>
+          <w:rFonts w:hint="eastAsia"/>
+        </w:rPr>
+        <w:t xml:space="preserve">肺移植的优势和困难同时更突出。肺移植受者感染、原发移植物功能障碍、急性细胞排斥、AMR、CLAD</w:t>
+      </w:r>
+      <w:r>
+        <w:t xml:space="preserve"> </w:t>
+      </w:r>
+      <w:r>
+        <w:rPr>
+          <w:rFonts w:hint="eastAsia"/>
+        </w:rPr>
+        <w:t xml:space="preserve">和气道并发症频繁发生，组织采样负担高且病灶异质。临床验证研究显示，dd-cfDNA</w:t>
+      </w:r>
+      <w:r>
+        <w:t xml:space="preserve"> </w:t>
+      </w:r>
+      <w:r>
+        <w:rPr>
+          <w:rFonts w:hint="eastAsia"/>
+        </w:rPr>
+        <w:t xml:space="preserve">对急性排斥具有较高阴性预测价值，也能反映感染和</w:t>
+      </w:r>
+      <w:r>
+        <w:t xml:space="preserve"> CLAD/NRAD </w:t>
+      </w:r>
+      <w:r>
+        <w:rPr>
+          <w:rFonts w:hint="eastAsia"/>
+        </w:rPr>
+        <w:t xml:space="preserve">等多种同种移植物损伤</w:t>
+      </w:r>
+      <w:r>
+        <w:t xml:space="preserve">(</w:t>
+      </w:r>
+      <w:hyperlink w:anchor="ref-clinicalvalidationof2022">
+        <w:r>
+          <w:rPr>
+            <w:rStyle w:val="Hyperlink"/>
+          </w:rPr>
+          <w:t xml:space="preserve">J. P. Rosenheck </w:t>
+        </w:r>
+        <w:r>
+          <w:rPr>
+            <w:rStyle w:val="Hyperlink"/>
+            <w:rFonts w:hint="eastAsia"/>
+          </w:rPr>
+          <w:t xml:space="preserve">等</w:t>
+        </w:r>
+        <w:r>
+          <w:rPr>
+            <w:rStyle w:val="Hyperlink"/>
+          </w:rPr>
+          <w:t xml:space="preserve"> </w:t>
+        </w:r>
+        <w:r>
+          <w:rPr>
+            <w:rStyle w:val="Hyperlink"/>
+            <w:rFonts w:hint="eastAsia"/>
+          </w:rPr>
+          <w:t xml:space="preserve">2022年</w:t>
+        </w:r>
+      </w:hyperlink>
+      <w:r>
+        <w:t xml:space="preserve">;</w:t>
+      </w:r>
+      <w:r>
+        <w:t xml:space="preserve"> </w:t>
+      </w:r>
+      <w:hyperlink w:anchor="ref-cellfreedna2022">
+        <w:r>
+          <w:rPr>
+            <w:rStyle w:val="Hyperlink"/>
+          </w:rPr>
+          <w:t xml:space="preserve">Keller </w:t>
+        </w:r>
+        <w:r>
+          <w:rPr>
+            <w:rStyle w:val="Hyperlink"/>
+            <w:rFonts w:hint="eastAsia"/>
+          </w:rPr>
+          <w:t xml:space="preserve">和</w:t>
+        </w:r>
+        <w:r>
+          <w:rPr>
+            <w:rStyle w:val="Hyperlink"/>
+          </w:rPr>
+          <w:t xml:space="preserve"> Agbor-Enoh </w:t>
+        </w:r>
+        <w:r>
+          <w:rPr>
+            <w:rStyle w:val="Hyperlink"/>
+            <w:rFonts w:hint="eastAsia"/>
+          </w:rPr>
+          <w:t xml:space="preserve">2022年</w:t>
+        </w:r>
+      </w:hyperlink>
+      <w:r>
+        <w:t xml:space="preserve">)</w:t>
+      </w:r>
+      <w:r>
+        <w:rPr>
+          <w:rFonts w:hint="eastAsia"/>
+        </w:rPr>
+        <w:t xml:space="preserve">。这使其非常适合做“低风险排除”和“何时进一步支气管镜/活检”的触发器，却不适合单独区分排斥与感染。对于移植两年以上患者，相对变化可能比固定绝对阈值更能识别急性肺移植物功能障碍，提示肺移植尤其需要个体基线和参考变化值</w:t>
+      </w:r>
+      <w:r>
+        <w:t xml:space="preserve">(</w:t>
+      </w:r>
+      <w:hyperlink w:anchor="ref-relativechangein2023">
+        <w:r>
+          <w:rPr>
+            <w:rStyle w:val="Hyperlink"/>
+          </w:rPr>
+          <w:t xml:space="preserve">Trindade </w:t>
+        </w:r>
+        <w:r>
+          <w:rPr>
+            <w:rStyle w:val="Hyperlink"/>
+            <w:rFonts w:hint="eastAsia"/>
+          </w:rPr>
+          <w:t xml:space="preserve">等</w:t>
+        </w:r>
+        <w:r>
+          <w:rPr>
+            <w:rStyle w:val="Hyperlink"/>
+          </w:rPr>
+          <w:t xml:space="preserve"> </w:t>
+        </w:r>
+        <w:r>
+          <w:rPr>
+            <w:rStyle w:val="Hyperlink"/>
+            <w:rFonts w:hint="eastAsia"/>
+          </w:rPr>
+          <w:t xml:space="preserve">2023年</w:t>
+        </w:r>
+      </w:hyperlink>
+      <w:r>
+        <w:t xml:space="preserve">)</w:t>
+      </w:r>
+      <w:r>
+        <w:rPr>
+          <w:rFonts w:hint="eastAsia"/>
+        </w:rPr>
+        <w:t xml:space="preserve">。系统综述和单中心研究也支持</w:t>
+      </w:r>
+      <w:r>
+        <w:t xml:space="preserve"> dd-cfDNA </w:t>
+      </w:r>
+      <w:r>
+        <w:rPr>
+          <w:rFonts w:hint="eastAsia"/>
+        </w:rPr>
+        <w:t xml:space="preserve">在肺移植排斥监测中的诊断潜力，但异质性较高，未来试验必须把感染、CLAD</w:t>
+      </w:r>
+      <w:r>
+        <w:t xml:space="preserve"> </w:t>
+      </w:r>
+      <w:r>
+        <w:rPr>
+          <w:rFonts w:hint="eastAsia"/>
+        </w:rPr>
+        <w:t xml:space="preserve">和治疗反应分别建模</w:t>
+      </w:r>
+      <w:r>
+        <w:t xml:space="preserve">(</w:t>
+      </w:r>
+      <w:hyperlink w:anchor="ref-circulatingdonorderived2023">
+        <w:r>
+          <w:rPr>
+            <w:rStyle w:val="Hyperlink"/>
+          </w:rPr>
+          <w:t xml:space="preserve">Li </w:t>
+        </w:r>
+        <w:r>
+          <w:rPr>
+            <w:rStyle w:val="Hyperlink"/>
+            <w:rFonts w:hint="eastAsia"/>
+          </w:rPr>
+          <w:t xml:space="preserve">和</w:t>
+        </w:r>
+        <w:r>
+          <w:rPr>
+            <w:rStyle w:val="Hyperlink"/>
+          </w:rPr>
+          <w:t xml:space="preserve"> Liang </w:t>
+        </w:r>
+        <w:r>
+          <w:rPr>
+            <w:rStyle w:val="Hyperlink"/>
+            <w:rFonts w:hint="eastAsia"/>
+          </w:rPr>
+          <w:t xml:space="preserve">2023年</w:t>
+        </w:r>
+      </w:hyperlink>
+      <w:r>
+        <w:t xml:space="preserve">;</w:t>
+      </w:r>
+      <w:r>
+        <w:t xml:space="preserve"> </w:t>
+      </w:r>
+      <w:hyperlink w:anchor="ref-applicationofplasma2023">
+        <w:r>
+          <w:rPr>
+            <w:rStyle w:val="Hyperlink"/>
+          </w:rPr>
+          <w:t xml:space="preserve">Ju </w:t>
+        </w:r>
+        <w:r>
+          <w:rPr>
+            <w:rStyle w:val="Hyperlink"/>
+            <w:rFonts w:hint="eastAsia"/>
+          </w:rPr>
+          <w:t xml:space="preserve">等</w:t>
+        </w:r>
+        <w:r>
+          <w:rPr>
+            <w:rStyle w:val="Hyperlink"/>
+          </w:rPr>
+          <w:t xml:space="preserve"> </w:t>
+        </w:r>
+        <w:r>
+          <w:rPr>
+            <w:rStyle w:val="Hyperlink"/>
+            <w:rFonts w:hint="eastAsia"/>
+          </w:rPr>
+          <w:t xml:space="preserve">2023年</w:t>
+        </w:r>
+      </w:hyperlink>
+      <w:r>
+        <w:t xml:space="preserve">;</w:t>
+      </w:r>
+      <w:r>
+        <w:t xml:space="preserve"> </w:t>
+      </w:r>
+      <w:hyperlink w:anchor="ref-whycellfree2022">
+        <w:r>
+          <w:rPr>
+            <w:rStyle w:val="Hyperlink"/>
+          </w:rPr>
+          <w:t xml:space="preserve">J. Rosenheck </w:t>
+        </w:r>
+        <w:r>
+          <w:rPr>
+            <w:rStyle w:val="Hyperlink"/>
+            <w:rFonts w:hint="eastAsia"/>
+          </w:rPr>
+          <w:t xml:space="preserve">等</w:t>
+        </w:r>
+        <w:r>
+          <w:rPr>
+            <w:rStyle w:val="Hyperlink"/>
+          </w:rPr>
+          <w:t xml:space="preserve"> </w:t>
+        </w:r>
+        <w:r>
+          <w:rPr>
+            <w:rStyle w:val="Hyperlink"/>
+            <w:rFonts w:hint="eastAsia"/>
+          </w:rPr>
+          <w:t xml:space="preserve">2022年</w:t>
+        </w:r>
+      </w:hyperlink>
+      <w:r>
+        <w:t xml:space="preserve">)</w:t>
+      </w:r>
+      <w:r>
+        <w:t xml:space="preserve">。</w:t>
+      </w:r>
+    </w:p>
+    <w:p>
+      <w:pPr>
+        <w:pStyle w:val="BodyText"/>
+      </w:pPr>
+      <w:r>
+        <w:rPr>
+          <w:rFonts w:hint="eastAsia"/>
+        </w:rPr>
+        <w:t xml:space="preserve">肝移植则不能简单套用肾或心的阈值。肝脏体量大、细胞更新和再生能力强，围手术期</w:t>
+      </w:r>
+      <w:r>
+        <w:t xml:space="preserve"> dd-cfDNA </w:t>
+      </w:r>
+      <w:r>
+        <w:rPr>
+          <w:rFonts w:hint="eastAsia"/>
+        </w:rPr>
+        <w:t xml:space="preserve">峰值高，胆汁淤积、缺血再灌注、血管/胆道并发症、感染和药物性肝损伤均可能导致升高。成人肝移植研究显示，术后</w:t>
+      </w:r>
+      <w:r>
+        <w:t xml:space="preserve"> dd-cfDNA </w:t>
+      </w:r>
+      <w:r>
+        <w:rPr>
+          <w:rFonts w:hint="eastAsia"/>
+        </w:rPr>
+        <w:t xml:space="preserve">与转氨酶和组织损伤相关，D-HOPE</w:t>
+      </w:r>
+      <w:r>
+        <w:t xml:space="preserve"> </w:t>
+      </w:r>
+      <w:r>
+        <w:rPr>
+          <w:rFonts w:hint="eastAsia"/>
+        </w:rPr>
+        <w:t xml:space="preserve">灌注液中的线粒体</w:t>
+      </w:r>
+      <w:r>
+        <w:t xml:space="preserve"> cfDNA </w:t>
+      </w:r>
+      <w:r>
+        <w:rPr>
+          <w:rFonts w:hint="eastAsia"/>
+        </w:rPr>
+        <w:t xml:space="preserve">还与早期移植物功能和严重并发症相关</w:t>
+      </w:r>
+      <w:r>
+        <w:t xml:space="preserve">(</w:t>
+      </w:r>
+      <w:hyperlink w:anchor="ref-circulatingcellfree2024">
+        <w:r>
+          <w:rPr>
+            <w:rStyle w:val="Hyperlink"/>
+          </w:rPr>
+          <w:t xml:space="preserve">Sorbini </w:t>
+        </w:r>
+        <w:r>
+          <w:rPr>
+            <w:rStyle w:val="Hyperlink"/>
+            <w:rFonts w:hint="eastAsia"/>
+          </w:rPr>
+          <w:t xml:space="preserve">等</w:t>
+        </w:r>
+        <w:r>
+          <w:rPr>
+            <w:rStyle w:val="Hyperlink"/>
+          </w:rPr>
+          <w:t xml:space="preserve"> </w:t>
+        </w:r>
+        <w:r>
+          <w:rPr>
+            <w:rStyle w:val="Hyperlink"/>
+            <w:rFonts w:hint="eastAsia"/>
+          </w:rPr>
+          <w:t xml:space="preserve">2024年</w:t>
+        </w:r>
+      </w:hyperlink>
+      <w:r>
+        <w:t xml:space="preserve">)</w:t>
+      </w:r>
+      <w:r>
+        <w:rPr>
+          <w:rFonts w:hint="eastAsia"/>
+        </w:rPr>
+        <w:t xml:space="preserve">。儿科和前瞻性队列提示</w:t>
+      </w:r>
+      <w:r>
+        <w:t xml:space="preserve"> dd-cfDNA </w:t>
+      </w:r>
+      <w:r>
+        <w:rPr>
+          <w:rFonts w:hint="eastAsia"/>
+        </w:rPr>
+        <w:t xml:space="preserve">可辅助识别急性排斥，但胆汁淤积等混杂因素会降低阳性预测值；miRNA</w:t>
+      </w:r>
+      <w:r>
+        <w:t xml:space="preserve"> </w:t>
+      </w:r>
+      <w:r>
+        <w:rPr>
+          <w:rFonts w:hint="eastAsia"/>
+        </w:rPr>
+        <w:t xml:space="preserve">等肝损伤/免疫调节标志物可能提高病因解释力</w:t>
+      </w:r>
+      <w:r>
+        <w:t xml:space="preserve">(</w:t>
+      </w:r>
+      <w:hyperlink w:anchor="ref-preliminaryclinicalexperience2021">
+        <w:r>
+          <w:rPr>
+            <w:rStyle w:val="Hyperlink"/>
+          </w:rPr>
+          <w:t xml:space="preserve">Zhao </w:t>
+        </w:r>
+        <w:r>
+          <w:rPr>
+            <w:rStyle w:val="Hyperlink"/>
+            <w:rFonts w:hint="eastAsia"/>
+          </w:rPr>
+          <w:t xml:space="preserve">等</w:t>
+        </w:r>
+        <w:r>
+          <w:rPr>
+            <w:rStyle w:val="Hyperlink"/>
+          </w:rPr>
+          <w:t xml:space="preserve"> </w:t>
+        </w:r>
+        <w:r>
+          <w:rPr>
+            <w:rStyle w:val="Hyperlink"/>
+            <w:rFonts w:hint="eastAsia"/>
+          </w:rPr>
+          <w:t xml:space="preserve">2021年</w:t>
+        </w:r>
+      </w:hyperlink>
+      <w:r>
+        <w:t xml:space="preserve">;</w:t>
+      </w:r>
+      <w:r>
+        <w:t xml:space="preserve"> </w:t>
+      </w:r>
+      <w:hyperlink w:anchor="ref-donorderivedcell20252">
+        <w:r>
+          <w:rPr>
+            <w:rStyle w:val="Hyperlink"/>
+          </w:rPr>
+          <w:t xml:space="preserve">Julian </w:t>
+        </w:r>
+        <w:r>
+          <w:rPr>
+            <w:rStyle w:val="Hyperlink"/>
+            <w:rFonts w:hint="eastAsia"/>
+          </w:rPr>
+          <w:t xml:space="preserve">等</w:t>
+        </w:r>
+        <w:r>
+          <w:rPr>
+            <w:rStyle w:val="Hyperlink"/>
+          </w:rPr>
+          <w:t xml:space="preserve"> </w:t>
+        </w:r>
+        <w:r>
+          <w:rPr>
+            <w:rStyle w:val="Hyperlink"/>
+            <w:rFonts w:hint="eastAsia"/>
+          </w:rPr>
+          <w:t xml:space="preserve">2025年</w:t>
+        </w:r>
+      </w:hyperlink>
+      <w:r>
+        <w:t xml:space="preserve">;</w:t>
+      </w:r>
+      <w:r>
+        <w:t xml:space="preserve"> </w:t>
+      </w:r>
+      <w:hyperlink w:anchor="ref-advancesandchallenges2025">
+        <w:r>
+          <w:rPr>
+            <w:rStyle w:val="Hyperlink"/>
+          </w:rPr>
+          <w:t xml:space="preserve">Zhong </w:t>
+        </w:r>
+        <w:r>
+          <w:rPr>
+            <w:rStyle w:val="Hyperlink"/>
+            <w:rFonts w:hint="eastAsia"/>
+          </w:rPr>
+          <w:t xml:space="preserve">等</w:t>
+        </w:r>
+        <w:r>
+          <w:rPr>
+            <w:rStyle w:val="Hyperlink"/>
+          </w:rPr>
+          <w:t xml:space="preserve"> </w:t>
+        </w:r>
+        <w:r>
+          <w:rPr>
+            <w:rStyle w:val="Hyperlink"/>
+            <w:rFonts w:hint="eastAsia"/>
+          </w:rPr>
+          <w:t xml:space="preserve">2025年</w:t>
+        </w:r>
+      </w:hyperlink>
+      <w:r>
+        <w:t xml:space="preserve">)</w:t>
+      </w:r>
+      <w:r>
+        <w:rPr>
+          <w:rFonts w:hint="eastAsia"/>
+        </w:rPr>
+        <w:t xml:space="preserve">。因此，肝移植</w:t>
+      </w:r>
+      <w:r>
+        <w:t xml:space="preserve"> dd-cfDNA </w:t>
+      </w:r>
+      <w:r>
+        <w:rPr>
+          <w:rFonts w:hint="eastAsia"/>
+        </w:rPr>
+        <w:t xml:space="preserve">更应作为“移植物完整性和损伤负荷”指标，结合肝酶模式、胆道影像、病毒学、药物暴露、miRNA</w:t>
+      </w:r>
+      <w:r>
+        <w:t xml:space="preserve"> </w:t>
+      </w:r>
+      <w:r>
+        <w:rPr>
+          <w:rFonts w:hint="eastAsia"/>
+        </w:rPr>
+        <w:t xml:space="preserve">和必要活检判断，而不是单独充当排斥诊断。</w:t>
+      </w:r>
+    </w:p>
+    <w:p>
+      <w:pPr>
+        <w:pStyle w:val="BodyText"/>
+      </w:pPr>
+      <w:r>
+        <w:rPr>
+          <w:rFonts w:hint="eastAsia"/>
+        </w:rPr>
+        <w:t xml:space="preserve">多器官移植进一步提出来源归属问题。当心肾、肝肾、胰肾或心肺联合移植时，血浆</w:t>
+      </w:r>
+      <w:r>
+        <w:t xml:space="preserve"> dd-cfDNA </w:t>
+      </w:r>
+      <w:r>
+        <w:rPr>
+          <w:rFonts w:hint="eastAsia"/>
+        </w:rPr>
+        <w:t xml:space="preserve">可能来自多个供体器官，比例值受到器官体量、基线释放和并发症的共同影响。心脏多器官移植研究显示，心肝和心肺受者</w:t>
+      </w:r>
+      <w:r>
+        <w:t xml:space="preserve"> dd-cfDNA </w:t>
+      </w:r>
+      <w:r>
+        <w:rPr>
+          <w:rFonts w:hint="eastAsia"/>
+        </w:rPr>
+        <w:t xml:space="preserve">水平和波动明显高于心肾，且可长期超过心移植常用阈值而无心脏排斥</w:t>
+      </w:r>
+      <w:r>
+        <w:t xml:space="preserve">(</w:t>
+      </w:r>
+      <w:hyperlink w:anchor="ref-clinicalutilityof2024">
         <w:r>
           <w:rPr>
             <w:rStyle w:val="Hyperlink"/>
@@ -912,37 +2758,29 @@
             <w:rStyle w:val="Hyperlink"/>
             <w:rFonts w:hint="eastAsia"/>
           </w:rPr>
-          <w:t xml:space="preserve">2025年</w:t>
+          <w:t xml:space="preserve">2024年</w:t>
         </w:r>
       </w:hyperlink>
       <w:r>
         <w:t xml:space="preserve">)</w:t>
       </w:r>
       <w:r>
-        <w:rPr>
-          <w:rFonts w:hint="eastAsia"/>
-        </w:rPr>
-        <w:t xml:space="preserve">。关键挑战是心衰、机械循环支持、感染和缺血损伤也会改变</w:t>
-      </w:r>
-      <w:r>
-        <w:t xml:space="preserve"> cfDNA </w:t>
-      </w:r>
-      <w:r>
-        <w:rPr>
-          <w:rFonts w:hint="eastAsia"/>
-        </w:rPr>
-        <w:t xml:space="preserve">背景。</w:t>
-      </w:r>
-    </w:p>
-    <w:p>
-      <w:pPr>
-        <w:pStyle w:val="BodyText"/>
-      </w:pPr>
-      <w:r>
-        <w:rPr>
-          <w:rFonts w:hint="eastAsia"/>
-        </w:rPr>
-        <w:t xml:space="preserve">肺移植中，感染、原发移植物功能障碍和慢性肺移植物功能障碍会让</w:t>
+        <w:t xml:space="preserve">。MOTR </w:t>
+      </w:r>
+      <w:r>
+        <w:rPr>
+          <w:rFonts w:hint="eastAsia"/>
+        </w:rPr>
+        <w:t xml:space="preserve">研究也提示，不同多器官组合的基线和器官功能异常关联不同，LKT</w:t>
+      </w:r>
+      <w:r>
+        <w:t xml:space="preserve"> </w:t>
+      </w:r>
+      <w:r>
+        <w:rPr>
+          <w:rFonts w:hint="eastAsia"/>
+        </w:rPr>
+        <w:t xml:space="preserve">等组合的</w:t>
       </w:r>
       <w:r>
         <w:t xml:space="preserve"> dd-cfDNA </w:t>
@@ -951,17 +2789,17 @@
         <w:rPr>
           <w:rFonts w:hint="eastAsia"/>
         </w:rPr>
-        <w:t xml:space="preserve">解释更复杂，但其连续监测价值很高，因为肺移植临床事件密集且组织采样负担重</w:t>
+        <w:t xml:space="preserve">水平不能按肾单器官阈值解释</w:t>
       </w:r>
       <w:r>
         <w:t xml:space="preserve">(</w:t>
       </w:r>
-      <w:hyperlink w:anchor="ref-donorderivedcell20231">
-        <w:r>
-          <w:rPr>
-            <w:rStyle w:val="Hyperlink"/>
-          </w:rPr>
-          <w:t xml:space="preserve">Benning </w:t>
+      <w:hyperlink w:anchor="ref-donorderivedcell2026">
+        <w:r>
+          <w:rPr>
+            <w:rStyle w:val="Hyperlink"/>
+          </w:rPr>
+          <w:t xml:space="preserve">Gupta </w:t>
         </w:r>
         <w:r>
           <w:rPr>
@@ -981,7 +2819,7 @@
             <w:rStyle w:val="Hyperlink"/>
             <w:rFonts w:hint="eastAsia"/>
           </w:rPr>
-          <w:t xml:space="preserve">2023年</w:t>
+          <w:t xml:space="preserve">2026年</w:t>
         </w:r>
       </w:hyperlink>
       <w:r>
@@ -991,99 +2829,7 @@
         <w:rPr>
           <w:rFonts w:hint="eastAsia"/>
         </w:rPr>
-        <w:t xml:space="preserve">。肝移植中，肝细胞体量大、再生能力强、手术早期释放高，dd-cfDNA</w:t>
-      </w:r>
-      <w:r>
-        <w:t xml:space="preserve"> </w:t>
-      </w:r>
-      <w:r>
-        <w:rPr>
-          <w:rFonts w:hint="eastAsia"/>
-        </w:rPr>
-        <w:t xml:space="preserve">的诊断阈值和时间窗需要单独建模；系统综述和荟萃分析正在推动这一领域从探索性研究进入诊断准确性评价</w:t>
-      </w:r>
-      <w:r>
-        <w:t xml:space="preserve">(</w:t>
-      </w:r>
-      <w:hyperlink w:anchor="ref-donorderivedcell2025">
-        <w:r>
-          <w:rPr>
-            <w:rStyle w:val="Hyperlink"/>
-          </w:rPr>
-          <w:t xml:space="preserve">Hirai </w:t>
-        </w:r>
-        <w:r>
-          <w:rPr>
-            <w:rStyle w:val="Hyperlink"/>
-            <w:rFonts w:hint="eastAsia"/>
-          </w:rPr>
-          <w:t xml:space="preserve">等</w:t>
-        </w:r>
-        <w:r>
-          <w:rPr>
-            <w:rStyle w:val="Hyperlink"/>
-          </w:rPr>
-          <w:t xml:space="preserve"> </w:t>
-        </w:r>
-        <w:r>
-          <w:rPr>
-            <w:rStyle w:val="Hyperlink"/>
-            <w:rFonts w:hint="eastAsia"/>
-          </w:rPr>
-          <w:t xml:space="preserve">2025年</w:t>
-        </w:r>
-      </w:hyperlink>
-      <w:r>
-        <w:t xml:space="preserve">;</w:t>
-      </w:r>
-      <w:r>
-        <w:t xml:space="preserve"> </w:t>
-      </w:r>
-      <w:hyperlink w:anchor="ref-donorderivedcell2026">
-        <w:r>
-          <w:rPr>
-            <w:rStyle w:val="Hyperlink"/>
-          </w:rPr>
-          <w:t xml:space="preserve">Gupta </w:t>
-        </w:r>
-        <w:r>
-          <w:rPr>
-            <w:rStyle w:val="Hyperlink"/>
-            <w:rFonts w:hint="eastAsia"/>
-          </w:rPr>
-          <w:t xml:space="preserve">等</w:t>
-        </w:r>
-        <w:r>
-          <w:rPr>
-            <w:rStyle w:val="Hyperlink"/>
-          </w:rPr>
-          <w:t xml:space="preserve"> </w:t>
-        </w:r>
-        <w:r>
-          <w:rPr>
-            <w:rStyle w:val="Hyperlink"/>
-            <w:rFonts w:hint="eastAsia"/>
-          </w:rPr>
-          <w:t xml:space="preserve">2026年</w:t>
-        </w:r>
-      </w:hyperlink>
-      <w:r>
-        <w:t xml:space="preserve">)</w:t>
-      </w:r>
-      <w:r>
-        <w:rPr>
-          <w:rFonts w:hint="eastAsia"/>
-        </w:rPr>
-        <w:t xml:space="preserve">。多器官移植则进一步提出来源归属问题：当心肾、肝肾或胰肾同时移植时，dd-cfDNA</w:t>
-      </w:r>
-      <w:r>
-        <w:t xml:space="preserve"> </w:t>
-      </w:r>
-      <w:r>
-        <w:rPr>
-          <w:rFonts w:hint="eastAsia"/>
-        </w:rPr>
-        <w:t xml:space="preserve">的器官来源、比例解释和干预决策必须依赖更精细的供体基因型和器官特异标志物。</w:t>
+        <w:t xml:space="preserve">。未来若要在多器官受者中做精确决策，需要供体特异基因型、组织来源甲基化/片段组学、器官特异蛋白或转录标志物共同判断损伤来自哪个移植物。</w:t>
       </w:r>
     </w:p>
     <w:bookmarkEnd w:id="12"/>
@@ -1119,25 +2865,102 @@
         <w:rPr>
           <w:rFonts w:hint="eastAsia"/>
         </w:rPr>
-        <w:t xml:space="preserve">最大的临床短板是病因特异性不足，多组学的价值也正在这里体现出来。尿液外泌体</w:t>
-      </w:r>
-      <w:r>
-        <w:t xml:space="preserve"> </w:t>
-      </w:r>
-      <w:r>
-        <w:rPr>
-          <w:rFonts w:hint="eastAsia"/>
-        </w:rPr>
-        <w:t xml:space="preserve">mRNA、尿液趋化因子、外周血转录组、蛋白组、代谢组、DSA、HLA</w:t>
-      </w:r>
-      <w:r>
-        <w:t xml:space="preserve"> eplet mismatch </w:t>
-      </w:r>
-      <w:r>
-        <w:rPr>
-          <w:rFonts w:hint="eastAsia"/>
-        </w:rPr>
-        <w:t xml:space="preserve">和病理分子分类，可以为</w:t>
+        <w:t xml:space="preserve">最大的临床短板是病因特异性不足，多组学的价值也正在这里体现出来。一个可执行的整合框架可以把证据分为四层：第一层是损伤负荷，包括</w:t>
+      </w:r>
+      <w:r>
+        <w:t xml:space="preserve"> dd-cfDNA fraction、absolute </w:t>
+      </w:r>
+      <w:r>
+        <w:rPr>
+          <w:rFonts w:hint="eastAsia"/>
+        </w:rPr>
+        <w:t xml:space="preserve">quantity、总</w:t>
+      </w:r>
+      <w:r>
+        <w:t xml:space="preserve"> cfDNA </w:t>
+      </w:r>
+      <w:r>
+        <w:rPr>
+          <w:rFonts w:hint="eastAsia"/>
+        </w:rPr>
+        <w:t xml:space="preserve">和趋势；第二层是免疫风险，包括</w:t>
+      </w:r>
+      <w:r>
+        <w:t xml:space="preserve"> </w:t>
+      </w:r>
+      <w:r>
+        <w:rPr>
+          <w:rFonts w:hint="eastAsia"/>
+        </w:rPr>
+        <w:t xml:space="preserve">DSA、非</w:t>
+      </w:r>
+      <w:r>
+        <w:t xml:space="preserve"> HLA </w:t>
+      </w:r>
+      <w:r>
+        <w:rPr>
+          <w:rFonts w:hint="eastAsia"/>
+        </w:rPr>
+        <w:t xml:space="preserve">抗体、HLA/eplet</w:t>
+      </w:r>
+      <w:r>
+        <w:t xml:space="preserve"> </w:t>
+      </w:r>
+      <w:r>
+        <w:rPr>
+          <w:rFonts w:hint="eastAsia"/>
+        </w:rPr>
+        <w:t xml:space="preserve">mismatch、既往排斥和免疫不依从；第三层是炎症和病因线索，包括尿液外泌体</w:t>
+      </w:r>
+      <w:r>
+        <w:t xml:space="preserve"> </w:t>
+      </w:r>
+      <w:r>
+        <w:rPr>
+          <w:rFonts w:hint="eastAsia"/>
+        </w:rPr>
+        <w:t xml:space="preserve">mRNA、尿液</w:t>
+      </w:r>
+      <w:r>
+        <w:t xml:space="preserve"> </w:t>
+      </w:r>
+      <w:r>
+        <w:rPr>
+          <w:rFonts w:hint="eastAsia"/>
+        </w:rPr>
+        <w:t xml:space="preserve">CXCL9/CXCL10、外周血转录组、蛋白组、miRNA、病毒负荷和感染证据；第四层是组织锚定，包括病理、MMDx</w:t>
+      </w:r>
+      <w:r>
+        <w:t xml:space="preserve"> </w:t>
+      </w:r>
+      <w:r>
+        <w:rPr>
+          <w:rFonts w:hint="eastAsia"/>
+        </w:rPr>
+        <w:t xml:space="preserve">或其他分子病理分类。只有当多个层面的证据方向一致时，dd-cfDNA</w:t>
+      </w:r>
+      <w:r>
+        <w:t xml:space="preserve"> </w:t>
+      </w:r>
+      <w:r>
+        <w:rPr>
+          <w:rFonts w:hint="eastAsia"/>
+        </w:rPr>
+        <w:t xml:space="preserve">才应推动强化免疫治疗；若证据分叉，合理动作往往是复测、寻找感染或进行病理确认。</w:t>
+      </w:r>
+    </w:p>
+    <w:p>
+      <w:pPr>
+        <w:pStyle w:val="BodyText"/>
+      </w:pPr>
+      <w:r>
+        <w:t xml:space="preserve">DSA </w:t>
+      </w:r>
+      <w:r>
+        <w:rPr>
+          <w:rFonts w:hint="eastAsia"/>
+        </w:rPr>
+        <w:t xml:space="preserve">与</w:t>
       </w:r>
       <w:r>
         <w:t xml:space="preserve"> dd-cfDNA </w:t>
@@ -1146,17 +2969,98 @@
         <w:rPr>
           <w:rFonts w:hint="eastAsia"/>
         </w:rPr>
-        <w:t xml:space="preserve">提供免疫通路解释</w:t>
+        <w:t xml:space="preserve">的整合最接近临床落地。DSA</w:t>
+      </w:r>
+      <w:r>
+        <w:t xml:space="preserve"> </w:t>
+      </w:r>
+      <w:r>
+        <w:rPr>
+          <w:rFonts w:hint="eastAsia"/>
+        </w:rPr>
+        <w:t xml:space="preserve">提示供受者之间存在免疫识别，dd-cfDNA</w:t>
+      </w:r>
+      <w:r>
+        <w:t xml:space="preserve"> </w:t>
+      </w:r>
+      <w:r>
+        <w:rPr>
+          <w:rFonts w:hint="eastAsia"/>
+        </w:rPr>
+        <w:t xml:space="preserve">提示这种风险是否已经转化为当前损伤。class</w:t>
+      </w:r>
+      <w:r>
+        <w:t xml:space="preserve"> II </w:t>
+      </w:r>
+      <w:r>
+        <w:rPr>
+          <w:rFonts w:hint="eastAsia"/>
+        </w:rPr>
+        <w:t xml:space="preserve">dnDSA、高</w:t>
+      </w:r>
+      <w:r>
+        <w:t xml:space="preserve"> MFI DSA、DQ </w:t>
+      </w:r>
+      <w:r>
+        <w:rPr>
+          <w:rFonts w:hint="eastAsia"/>
+        </w:rPr>
+        <w:t xml:space="preserve">抗体或</w:t>
+      </w:r>
+      <w:r>
+        <w:t xml:space="preserve"> DSA </w:t>
+      </w:r>
+      <w:r>
+        <w:rPr>
+          <w:rFonts w:hint="eastAsia"/>
+        </w:rPr>
+        <w:t xml:space="preserve">伴移植物功能异常时，dd-cfDNA</w:t>
+      </w:r>
+      <w:r>
+        <w:t xml:space="preserve"> </w:t>
+      </w:r>
+      <w:r>
+        <w:rPr>
+          <w:rFonts w:hint="eastAsia"/>
+        </w:rPr>
+        <w:t xml:space="preserve">升高显著提高</w:t>
+      </w:r>
+      <w:r>
+        <w:t xml:space="preserve"> ABMR/MVI </w:t>
+      </w:r>
+      <w:r>
+        <w:rPr>
+          <w:rFonts w:hint="eastAsia"/>
+        </w:rPr>
+        <w:t xml:space="preserve">的前测概率；反之，DSA</w:t>
+      </w:r>
+      <w:r>
+        <w:t xml:space="preserve"> </w:t>
+      </w:r>
+      <w:r>
+        <w:rPr>
+          <w:rFonts w:hint="eastAsia"/>
+        </w:rPr>
+        <w:t xml:space="preserve">阳性但</w:t>
+      </w:r>
+      <w:r>
+        <w:t xml:space="preserve"> dd-cfDNA </w:t>
+      </w:r>
+      <w:r>
+        <w:rPr>
+          <w:rFonts w:hint="eastAsia"/>
+        </w:rPr>
+        <w:t xml:space="preserve">长期低位可能提示暂不需要立即治疗，而应加强监测或选择性活检</w:t>
       </w:r>
       <w:r>
         <w:t xml:space="preserve">(</w:t>
       </w:r>
-      <w:hyperlink w:anchor="ref-discoveryofdonor2026">
-        <w:r>
-          <w:rPr>
-            <w:rStyle w:val="Hyperlink"/>
-          </w:rPr>
-          <w:t xml:space="preserve">Cuadrado-Payán </w:t>
+      <w:hyperlink w:anchor="ref-donorderivedcell2022">
+        <w:r>
+          <w:rPr>
+            <w:rStyle w:val="Hyperlink"/>
+          </w:rPr>
+          <w:t xml:space="preserve">Butiu </w:t>
         </w:r>
         <w:r>
           <w:rPr>
@@ -1176,7 +3080,7 @@
             <w:rStyle w:val="Hyperlink"/>
             <w:rFonts w:hint="eastAsia"/>
           </w:rPr>
-          <w:t xml:space="preserve">2026年</w:t>
+          <w:t xml:space="preserve">2022年</w:t>
         </w:r>
       </w:hyperlink>
       <w:r>
@@ -1185,25 +3089,253 @@
       <w:r>
         <w:t xml:space="preserve"> </w:t>
       </w:r>
-      <w:hyperlink w:anchor="ref-urinetrumpsthe2023">
-        <w:r>
-          <w:rPr>
-            <w:rStyle w:val="Hyperlink"/>
-          </w:rPr>
-          <w:t xml:space="preserve">Sarwal </w:t>
-        </w:r>
-        <w:r>
-          <w:rPr>
-            <w:rStyle w:val="Hyperlink"/>
-            <w:rFonts w:hint="eastAsia"/>
-          </w:rPr>
-          <w:t xml:space="preserve">和</w:t>
-        </w:r>
-        <w:r>
-          <w:rPr>
-            <w:rStyle w:val="Hyperlink"/>
-          </w:rPr>
-          <w:t xml:space="preserve"> Naesens </w:t>
+      <w:hyperlink w:anchor="ref-combiningdonorderived20221">
+        <w:r>
+          <w:rPr>
+            <w:rStyle w:val="Hyperlink"/>
+          </w:rPr>
+          <w:t xml:space="preserve">Obrișcă </w:t>
+        </w:r>
+        <w:r>
+          <w:rPr>
+            <w:rStyle w:val="Hyperlink"/>
+            <w:rFonts w:hint="eastAsia"/>
+          </w:rPr>
+          <w:t xml:space="preserve">等</w:t>
+        </w:r>
+        <w:r>
+          <w:rPr>
+            <w:rStyle w:val="Hyperlink"/>
+          </w:rPr>
+          <w:t xml:space="preserve"> </w:t>
+        </w:r>
+        <w:r>
+          <w:rPr>
+            <w:rStyle w:val="Hyperlink"/>
+            <w:rFonts w:hint="eastAsia"/>
+          </w:rPr>
+          <w:t xml:space="preserve">2022年</w:t>
+        </w:r>
+      </w:hyperlink>
+      <w:r>
+        <w:t xml:space="preserve">;</w:t>
+      </w:r>
+      <w:r>
+        <w:t xml:space="preserve"> </w:t>
+      </w:r>
+      <w:hyperlink w:anchor="ref-perspectivefordonor2024">
+        <w:r>
+          <w:rPr>
+            <w:rStyle w:val="Hyperlink"/>
+          </w:rPr>
+          <w:t xml:space="preserve">Akifova, Budde, Oellerich, </w:t>
+        </w:r>
+        <w:r>
+          <w:rPr>
+            <w:rStyle w:val="Hyperlink"/>
+            <w:rFonts w:hint="eastAsia"/>
+          </w:rPr>
+          <w:t xml:space="preserve">等</w:t>
+        </w:r>
+        <w:r>
+          <w:rPr>
+            <w:rStyle w:val="Hyperlink"/>
+          </w:rPr>
+          <w:t xml:space="preserve"> </w:t>
+        </w:r>
+        <w:r>
+          <w:rPr>
+            <w:rStyle w:val="Hyperlink"/>
+            <w:rFonts w:hint="eastAsia"/>
+          </w:rPr>
+          <w:t xml:space="preserve">2024年</w:t>
+        </w:r>
+      </w:hyperlink>
+      <w:r>
+        <w:t xml:space="preserve">)</w:t>
+      </w:r>
+      <w:r>
+        <w:rPr>
+          <w:rFonts w:hint="eastAsia"/>
+        </w:rPr>
+        <w:t xml:space="preserve">。但是</w:t>
+      </w:r>
+      <w:r>
+        <w:t xml:space="preserve"> DSA </w:t>
+      </w:r>
+      <w:r>
+        <w:rPr>
+          <w:rFonts w:hint="eastAsia"/>
+        </w:rPr>
+        <w:t xml:space="preserve">阴性并不排除</w:t>
+      </w:r>
+      <w:r>
+        <w:t xml:space="preserve"> </w:t>
+      </w:r>
+      <w:r>
+        <w:rPr>
+          <w:rFonts w:hint="eastAsia"/>
+        </w:rPr>
+        <w:t xml:space="preserve">ABMR，非</w:t>
+      </w:r>
+      <w:r>
+        <w:t xml:space="preserve"> HLA </w:t>
+      </w:r>
+      <w:r>
+        <w:rPr>
+          <w:rFonts w:hint="eastAsia"/>
+        </w:rPr>
+        <w:t xml:space="preserve">抗体和分子</w:t>
+      </w:r>
+      <w:r>
+        <w:t xml:space="preserve"> AMR </w:t>
+      </w:r>
+      <w:r>
+        <w:rPr>
+          <w:rFonts w:hint="eastAsia"/>
+        </w:rPr>
+        <w:t xml:space="preserve">均可能释放</w:t>
+      </w:r>
+      <w:r>
+        <w:t xml:space="preserve"> </w:t>
+      </w:r>
+      <w:r>
+        <w:rPr>
+          <w:rFonts w:hint="eastAsia"/>
+        </w:rPr>
+        <w:t xml:space="preserve">dd-cfDNA；因此联合模型不应把</w:t>
+      </w:r>
+      <w:r>
+        <w:t xml:space="preserve"> DSA </w:t>
+      </w:r>
+      <w:r>
+        <w:rPr>
+          <w:rFonts w:hint="eastAsia"/>
+        </w:rPr>
+        <w:t xml:space="preserve">作为绝对门槛，而应把</w:t>
+      </w:r>
+      <w:r>
+        <w:t xml:space="preserve"> DSA、dd-cfDNA </w:t>
+      </w:r>
+      <w:r>
+        <w:rPr>
+          <w:rFonts w:hint="eastAsia"/>
+        </w:rPr>
+        <w:t xml:space="preserve">和病理/分子表型视为互补证据</w:t>
+      </w:r>
+      <w:r>
+        <w:t xml:space="preserve">(</w:t>
+      </w:r>
+      <w:hyperlink w:anchor="ref-antibodymediatedrejection2022">
+        <w:r>
+          <w:rPr>
+            <w:rStyle w:val="Hyperlink"/>
+          </w:rPr>
+          <w:t xml:space="preserve">Halloran, J. Reeve, Madill-Thomsen, Demko, </w:t>
+        </w:r>
+        <w:r>
+          <w:rPr>
+            <w:rStyle w:val="Hyperlink"/>
+            <w:rFonts w:hint="eastAsia"/>
+          </w:rPr>
+          <w:t xml:space="preserve">等</w:t>
+        </w:r>
+        <w:r>
+          <w:rPr>
+            <w:rStyle w:val="Hyperlink"/>
+          </w:rPr>
+          <w:t xml:space="preserve"> </w:t>
+        </w:r>
+        <w:r>
+          <w:rPr>
+            <w:rStyle w:val="Hyperlink"/>
+            <w:rFonts w:hint="eastAsia"/>
+          </w:rPr>
+          <w:t xml:space="preserve">2022年</w:t>
+        </w:r>
+      </w:hyperlink>
+      <w:r>
+        <w:t xml:space="preserve">;</w:t>
+      </w:r>
+      <w:r>
+        <w:t xml:space="preserve"> </w:t>
+      </w:r>
+      <w:hyperlink w:anchor="ref-utilityofdonor2021">
+        <w:r>
+          <w:rPr>
+            <w:rStyle w:val="Hyperlink"/>
+          </w:rPr>
+          <w:t xml:space="preserve">Kant </w:t>
+        </w:r>
+        <w:r>
+          <w:rPr>
+            <w:rStyle w:val="Hyperlink"/>
+            <w:rFonts w:hint="eastAsia"/>
+          </w:rPr>
+          <w:t xml:space="preserve">等</w:t>
+        </w:r>
+        <w:r>
+          <w:rPr>
+            <w:rStyle w:val="Hyperlink"/>
+          </w:rPr>
+          <w:t xml:space="preserve"> </w:t>
+        </w:r>
+        <w:r>
+          <w:rPr>
+            <w:rStyle w:val="Hyperlink"/>
+            <w:rFonts w:hint="eastAsia"/>
+          </w:rPr>
+          <w:t xml:space="preserve">2021年</w:t>
+        </w:r>
+      </w:hyperlink>
+      <w:r>
+        <w:t xml:space="preserve">)</w:t>
+      </w:r>
+      <w:r>
+        <w:t xml:space="preserve">。</w:t>
+      </w:r>
+    </w:p>
+    <w:p>
+      <w:pPr>
+        <w:pStyle w:val="BodyText"/>
+      </w:pPr>
+      <w:r>
+        <w:rPr>
+          <w:rFonts w:hint="eastAsia"/>
+        </w:rPr>
+        <w:t xml:space="preserve">尿液和外泌体组学适合补足肾移植的局部病因线索。尿液外泌体、mRNA/miRNA、趋化因子和尿液</w:t>
+      </w:r>
+      <w:r>
+        <w:t xml:space="preserve"> dd-cfDNA </w:t>
+      </w:r>
+      <w:r>
+        <w:rPr>
+          <w:rFonts w:hint="eastAsia"/>
+        </w:rPr>
+        <w:t xml:space="preserve">更接近泌尿系统局部微环境，可提供肾小管炎症、病毒性损伤和免疫细胞募集信息</w:t>
+      </w:r>
+      <w:r>
+        <w:t xml:space="preserve">(</w:t>
+      </w:r>
+      <w:hyperlink w:anchor="ref-liquidbiopsyfor2023">
+        <w:r>
+          <w:rPr>
+            <w:rStyle w:val="Hyperlink"/>
+          </w:rPr>
+          <w:t xml:space="preserve">Nassar </w:t>
+        </w:r>
+        <w:r>
+          <w:rPr>
+            <w:rStyle w:val="Hyperlink"/>
+            <w:rFonts w:hint="eastAsia"/>
+          </w:rPr>
+          <w:t xml:space="preserve">等</w:t>
+        </w:r>
+        <w:r>
+          <w:rPr>
+            <w:rStyle w:val="Hyperlink"/>
+          </w:rPr>
+          <w:t xml:space="preserve"> </w:t>
         </w:r>
         <w:r>
           <w:rPr>
@@ -1219,12 +3351,12 @@
       <w:r>
         <w:t xml:space="preserve"> </w:t>
       </w:r>
-      <w:hyperlink w:anchor="ref-biomarkersinkidney2024">
-        <w:r>
-          <w:rPr>
-            <w:rStyle w:val="Hyperlink"/>
-          </w:rPr>
-          <w:t xml:space="preserve">Gupta </w:t>
+      <w:hyperlink w:anchor="ref-molecularimmunemonitoring2023">
+        <w:r>
+          <w:rPr>
+            <w:rStyle w:val="Hyperlink"/>
+          </w:rPr>
+          <w:t xml:space="preserve">Chancharoenthana </w:t>
         </w:r>
         <w:r>
           <w:rPr>
@@ -1244,6 +3376,306 @@
             <w:rStyle w:val="Hyperlink"/>
             <w:rFonts w:hint="eastAsia"/>
           </w:rPr>
+          <w:t xml:space="preserve">2023年</w:t>
+        </w:r>
+      </w:hyperlink>
+      <w:r>
+        <w:t xml:space="preserve">)</w:t>
+      </w:r>
+      <w:r>
+        <w:rPr>
+          <w:rFonts w:hint="eastAsia"/>
+        </w:rPr>
+        <w:t xml:space="preserve">。已有研究显示，尿液</w:t>
+      </w:r>
+      <w:r>
+        <w:t xml:space="preserve"> dd-cfDNA </w:t>
+      </w:r>
+      <w:r>
+        <w:rPr>
+          <w:rFonts w:hint="eastAsia"/>
+        </w:rPr>
+        <w:t xml:space="preserve">浓度可能更明显关联</w:t>
+      </w:r>
+      <w:r>
+        <w:t xml:space="preserve"> BK </w:t>
+      </w:r>
+      <w:r>
+        <w:rPr>
+          <w:rFonts w:hint="eastAsia"/>
+        </w:rPr>
+        <w:t xml:space="preserve">病毒相关肾病，而血浆</w:t>
+      </w:r>
+      <w:r>
+        <w:t xml:space="preserve"> fraction </w:t>
+      </w:r>
+      <w:r>
+        <w:rPr>
+          <w:rFonts w:hint="eastAsia"/>
+        </w:rPr>
+        <w:t xml:space="preserve">更突出</w:t>
+      </w:r>
+      <w:r>
+        <w:t xml:space="preserve"> ABMR </w:t>
+      </w:r>
+      <w:r>
+        <w:rPr>
+          <w:rFonts w:hint="eastAsia"/>
+        </w:rPr>
+        <w:t xml:space="preserve">和微血管炎症；尿液趋化因子在</w:t>
+      </w:r>
+      <w:r>
+        <w:t xml:space="preserve"> BKPyVAN </w:t>
+      </w:r>
+      <w:r>
+        <w:rPr>
+          <w:rFonts w:hint="eastAsia"/>
+        </w:rPr>
+        <w:t xml:space="preserve">与</w:t>
+      </w:r>
+      <w:r>
+        <w:t xml:space="preserve"> TCMR </w:t>
+      </w:r>
+      <w:r>
+        <w:rPr>
+          <w:rFonts w:hint="eastAsia"/>
+        </w:rPr>
+        <w:t xml:space="preserve">中又可能重叠</w:t>
+      </w:r>
+      <w:r>
+        <w:t xml:space="preserve">(</w:t>
+      </w:r>
+      <w:hyperlink w:anchor="ref-usingbothplasma2022">
+        <w:r>
+          <w:rPr>
+            <w:rStyle w:val="Hyperlink"/>
+          </w:rPr>
+          <w:t xml:space="preserve">Chen </w:t>
+        </w:r>
+        <w:r>
+          <w:rPr>
+            <w:rStyle w:val="Hyperlink"/>
+            <w:rFonts w:hint="eastAsia"/>
+          </w:rPr>
+          <w:t xml:space="preserve">等</w:t>
+        </w:r>
+        <w:r>
+          <w:rPr>
+            <w:rStyle w:val="Hyperlink"/>
+          </w:rPr>
+          <w:t xml:space="preserve"> </w:t>
+        </w:r>
+        <w:r>
+          <w:rPr>
+            <w:rStyle w:val="Hyperlink"/>
+            <w:rFonts w:hint="eastAsia"/>
+          </w:rPr>
+          <w:t xml:space="preserve">2022年</w:t>
+        </w:r>
+      </w:hyperlink>
+      <w:r>
+        <w:t xml:space="preserve">;</w:t>
+      </w:r>
+      <w:r>
+        <w:t xml:space="preserve"> </w:t>
+      </w:r>
+      <w:hyperlink w:anchor="ref-levelsofdonor2022">
+        <w:r>
+          <w:rPr>
+            <w:rStyle w:val="Hyperlink"/>
+          </w:rPr>
+          <w:t xml:space="preserve">Mayer </w:t>
+        </w:r>
+        <w:r>
+          <w:rPr>
+            <w:rStyle w:val="Hyperlink"/>
+            <w:rFonts w:hint="eastAsia"/>
+          </w:rPr>
+          <w:t xml:space="preserve">等</w:t>
+        </w:r>
+        <w:r>
+          <w:rPr>
+            <w:rStyle w:val="Hyperlink"/>
+          </w:rPr>
+          <w:t xml:space="preserve"> </w:t>
+        </w:r>
+        <w:r>
+          <w:rPr>
+            <w:rStyle w:val="Hyperlink"/>
+            <w:rFonts w:hint="eastAsia"/>
+          </w:rPr>
+          <w:t xml:space="preserve">2022年</w:t>
+        </w:r>
+      </w:hyperlink>
+      <w:r>
+        <w:t xml:space="preserve">)</w:t>
+      </w:r>
+      <w:r>
+        <w:rPr>
+          <w:rFonts w:hint="eastAsia"/>
+        </w:rPr>
+        <w:t xml:space="preserve">。这说明尿液信号不能简单作为血浆</w:t>
+      </w:r>
+      <w:r>
+        <w:t xml:space="preserve"> dd-cfDNA </w:t>
+      </w:r>
+      <w:r>
+        <w:rPr>
+          <w:rFonts w:hint="eastAsia"/>
+        </w:rPr>
+        <w:t xml:space="preserve">的替代，而应作为病因鉴别的一部分：血浆</w:t>
+      </w:r>
+      <w:r>
+        <w:t xml:space="preserve"> dd-cfDNA </w:t>
+      </w:r>
+      <w:r>
+        <w:rPr>
+          <w:rFonts w:hint="eastAsia"/>
+        </w:rPr>
+        <w:t xml:space="preserve">回答“移植物是否在受损”，尿液外泌体/趋化因子帮助回答“肾内炎症、病毒复制或小管损伤是否参与”。</w:t>
+      </w:r>
+    </w:p>
+    <w:p>
+      <w:pPr>
+        <w:pStyle w:val="BodyText"/>
+      </w:pPr>
+      <w:r>
+        <w:rPr>
+          <w:rFonts w:hint="eastAsia"/>
+        </w:rPr>
+        <w:t xml:space="preserve">外周血转录组、蛋白组和分子病理提供另一个维度。免疫静息基因表达签名与</w:t>
+      </w:r>
+      <w:r>
+        <w:t xml:space="preserve"> dd-cfDNA </w:t>
+      </w:r>
+      <w:r>
+        <w:rPr>
+          <w:rFonts w:hint="eastAsia"/>
+        </w:rPr>
+        <w:t xml:space="preserve">信号不完全相关，二者联合可改善对肾移植静息与排斥的区分</w:t>
+      </w:r>
+      <w:r>
+        <w:t xml:space="preserve">(</w:t>
+      </w:r>
+      <w:hyperlink w:anchor="ref-clinicalvalidationof2021">
+        <w:r>
+          <w:rPr>
+            <w:rStyle w:val="Hyperlink"/>
+          </w:rPr>
+          <w:t xml:space="preserve">Akalin </w:t>
+        </w:r>
+        <w:r>
+          <w:rPr>
+            <w:rStyle w:val="Hyperlink"/>
+            <w:rFonts w:hint="eastAsia"/>
+          </w:rPr>
+          <w:t xml:space="preserve">等</w:t>
+        </w:r>
+        <w:r>
+          <w:rPr>
+            <w:rStyle w:val="Hyperlink"/>
+          </w:rPr>
+          <w:t xml:space="preserve"> </w:t>
+        </w:r>
+        <w:r>
+          <w:rPr>
+            <w:rStyle w:val="Hyperlink"/>
+            <w:rFonts w:hint="eastAsia"/>
+          </w:rPr>
+          <w:t xml:space="preserve">2021年</w:t>
+        </w:r>
+      </w:hyperlink>
+      <w:r>
+        <w:t xml:space="preserve">)</w:t>
+      </w:r>
+      <w:r>
+        <w:rPr>
+          <w:rFonts w:hint="eastAsia"/>
+        </w:rPr>
+        <w:t xml:space="preserve">。真实世界研究也提醒，单个商业转录组或</w:t>
+      </w:r>
+      <w:r>
+        <w:t xml:space="preserve"> dd-cfDNA </w:t>
+      </w:r>
+      <w:r>
+        <w:rPr>
+          <w:rFonts w:hint="eastAsia"/>
+        </w:rPr>
+        <w:t xml:space="preserve">检测未必能在未选择人群中准确诊断所有排斥，但在</w:t>
+      </w:r>
+      <w:r>
+        <w:t xml:space="preserve"> DSA </w:t>
+      </w:r>
+      <w:r>
+        <w:rPr>
+          <w:rFonts w:hint="eastAsia"/>
+        </w:rPr>
+        <w:t xml:space="preserve">阳性且移植物功能异常的</w:t>
+      </w:r>
+      <w:r>
+        <w:t xml:space="preserve"> for-cause </w:t>
+      </w:r>
+      <w:r>
+        <w:rPr>
+          <w:rFonts w:hint="eastAsia"/>
+        </w:rPr>
+        <w:t xml:space="preserve">场景中，dd-cfDNA</w:t>
+      </w:r>
+      <w:r>
+        <w:t xml:space="preserve"> </w:t>
+      </w:r>
+      <w:r>
+        <w:rPr>
+          <w:rFonts w:hint="eastAsia"/>
+        </w:rPr>
+        <w:t xml:space="preserve">与</w:t>
+      </w:r>
+      <w:r>
+        <w:t xml:space="preserve"> DSA </w:t>
+      </w:r>
+      <w:r>
+        <w:rPr>
+          <w:rFonts w:hint="eastAsia"/>
+        </w:rPr>
+        <w:t xml:space="preserve">组合对</w:t>
+      </w:r>
+      <w:r>
+        <w:t xml:space="preserve"> AMR/MVI </w:t>
+      </w:r>
+      <w:r>
+        <w:rPr>
+          <w:rFonts w:hint="eastAsia"/>
+        </w:rPr>
+        <w:t xml:space="preserve">更有价值</w:t>
+      </w:r>
+      <w:r>
+        <w:t xml:space="preserve">(</w:t>
+      </w:r>
+      <w:hyperlink w:anchor="ref-bloodgeneexpression2024">
+        <w:r>
+          <w:rPr>
+            <w:rStyle w:val="Hyperlink"/>
+          </w:rPr>
+          <w:t xml:space="preserve">Sellarés </w:t>
+        </w:r>
+        <w:r>
+          <w:rPr>
+            <w:rStyle w:val="Hyperlink"/>
+            <w:rFonts w:hint="eastAsia"/>
+          </w:rPr>
+          <w:t xml:space="preserve">等</w:t>
+        </w:r>
+        <w:r>
+          <w:rPr>
+            <w:rStyle w:val="Hyperlink"/>
+          </w:rPr>
+          <w:t xml:space="preserve"> </w:t>
+        </w:r>
+        <w:r>
+          <w:rPr>
+            <w:rStyle w:val="Hyperlink"/>
+            <w:rFonts w:hint="eastAsia"/>
+          </w:rPr>
           <w:t xml:space="preserve">2024年</w:t>
         </w:r>
       </w:hyperlink>
@@ -1251,37 +3683,205 @@
         <w:t xml:space="preserve">)</w:t>
       </w:r>
       <w:r>
-        <w:rPr>
-          <w:rFonts w:hint="eastAsia"/>
-        </w:rPr>
-        <w:t xml:space="preserve">。例如，dd-cfDNA</w:t>
-      </w:r>
-      <w:r>
-        <w:t xml:space="preserve"> </w:t>
-      </w:r>
-      <w:r>
-        <w:rPr>
-          <w:rFonts w:hint="eastAsia"/>
-        </w:rPr>
-        <w:t xml:space="preserve">升高并伴随</w:t>
-      </w:r>
-      <w:r>
-        <w:t xml:space="preserve"> </w:t>
-      </w:r>
-      <w:r>
-        <w:rPr>
-          <w:rFonts w:hint="eastAsia"/>
-        </w:rPr>
-        <w:t xml:space="preserve">DSA、微血管炎症和</w:t>
-      </w:r>
-      <w:r>
-        <w:t xml:space="preserve"> ABMR </w:t>
-      </w:r>
-      <w:r>
-        <w:rPr>
-          <w:rFonts w:hint="eastAsia"/>
-        </w:rPr>
-        <w:t xml:space="preserve">分子特征时，临床处理应不同于</w:t>
+        <w:t xml:space="preserve">。MMDx </w:t>
+      </w:r>
+      <w:r>
+        <w:rPr>
+          <w:rFonts w:hint="eastAsia"/>
+        </w:rPr>
+        <w:t xml:space="preserve">等分子病理进一步显示，AMR、TCMR、近期实质损伤和萎缩纤维化具有不同转录表型，dd-cfDNA</w:t>
+      </w:r>
+      <w:r>
+        <w:t xml:space="preserve"> </w:t>
+      </w:r>
+      <w:r>
+        <w:rPr>
+          <w:rFonts w:hint="eastAsia"/>
+        </w:rPr>
+        <w:t xml:space="preserve">可作为校准这些组织状态的血液损伤读数</w:t>
+      </w:r>
+      <w:r>
+        <w:t xml:space="preserve">(</w:t>
+      </w:r>
+      <w:hyperlink w:anchor="ref-themolecularphenotype2023">
+        <w:r>
+          <w:rPr>
+            <w:rStyle w:val="Hyperlink"/>
+          </w:rPr>
+          <w:t xml:space="preserve">Halloran </w:t>
+        </w:r>
+        <w:r>
+          <w:rPr>
+            <w:rStyle w:val="Hyperlink"/>
+            <w:rFonts w:hint="eastAsia"/>
+          </w:rPr>
+          <w:t xml:space="preserve">等</w:t>
+        </w:r>
+        <w:r>
+          <w:rPr>
+            <w:rStyle w:val="Hyperlink"/>
+          </w:rPr>
+          <w:t xml:space="preserve"> </w:t>
+        </w:r>
+        <w:r>
+          <w:rPr>
+            <w:rStyle w:val="Hyperlink"/>
+            <w:rFonts w:hint="eastAsia"/>
+          </w:rPr>
+          <w:t xml:space="preserve">2023年</w:t>
+        </w:r>
+      </w:hyperlink>
+      <w:r>
+        <w:t xml:space="preserve">;</w:t>
+      </w:r>
+      <w:r>
+        <w:t xml:space="preserve"> </w:t>
+      </w:r>
+      <w:hyperlink w:anchor="ref-distinctmolecularprocesses2023">
+        <w:r>
+          <w:rPr>
+            <w:rStyle w:val="Hyperlink"/>
+          </w:rPr>
+          <w:t xml:space="preserve">Gauthier </w:t>
+        </w:r>
+        <w:r>
+          <w:rPr>
+            <w:rStyle w:val="Hyperlink"/>
+            <w:rFonts w:hint="eastAsia"/>
+          </w:rPr>
+          <w:t xml:space="preserve">等</w:t>
+        </w:r>
+        <w:r>
+          <w:rPr>
+            <w:rStyle w:val="Hyperlink"/>
+          </w:rPr>
+          <w:t xml:space="preserve"> </w:t>
+        </w:r>
+        <w:r>
+          <w:rPr>
+            <w:rStyle w:val="Hyperlink"/>
+            <w:rFonts w:hint="eastAsia"/>
+          </w:rPr>
+          <w:t xml:space="preserve">2023年</w:t>
+        </w:r>
+      </w:hyperlink>
+      <w:r>
+        <w:t xml:space="preserve">)</w:t>
+      </w:r>
+      <w:r>
+        <w:rPr>
+          <w:rFonts w:hint="eastAsia"/>
+        </w:rPr>
+        <w:t xml:space="preserve">。蛋白组、代谢组和</w:t>
+      </w:r>
+      <w:r>
+        <w:t xml:space="preserve"> cfDNA </w:t>
+      </w:r>
+      <w:r>
+        <w:rPr>
+          <w:rFonts w:hint="eastAsia"/>
+        </w:rPr>
+        <w:t xml:space="preserve">甲基化/片段组学未来可能把“损伤来源”和“损伤通路”拆得更细，但当前仍需要标准化和外部验证</w:t>
+      </w:r>
+      <w:r>
+        <w:t xml:space="preserve">(</w:t>
+      </w:r>
+      <w:hyperlink w:anchor="ref-areviewof2024">
+        <w:r>
+          <w:rPr>
+            <w:rStyle w:val="Hyperlink"/>
+          </w:rPr>
+          <w:t xml:space="preserve">Sebastian </w:t>
+        </w:r>
+        <w:r>
+          <w:rPr>
+            <w:rStyle w:val="Hyperlink"/>
+            <w:rFonts w:hint="eastAsia"/>
+          </w:rPr>
+          <w:t xml:space="preserve">等</w:t>
+        </w:r>
+        <w:r>
+          <w:rPr>
+            <w:rStyle w:val="Hyperlink"/>
+          </w:rPr>
+          <w:t xml:space="preserve"> </w:t>
+        </w:r>
+        <w:r>
+          <w:rPr>
+            <w:rStyle w:val="Hyperlink"/>
+            <w:rFonts w:hint="eastAsia"/>
+          </w:rPr>
+          <w:t xml:space="preserve">2024年</w:t>
+        </w:r>
+      </w:hyperlink>
+      <w:r>
+        <w:t xml:space="preserve">;</w:t>
+      </w:r>
+      <w:r>
+        <w:t xml:space="preserve"> </w:t>
+      </w:r>
+      <w:hyperlink w:anchor="ref-donorderivedcell20251">
+        <w:r>
+          <w:rPr>
+            <w:rStyle w:val="Hyperlink"/>
+          </w:rPr>
+          <w:t xml:space="preserve">Kang </w:t>
+        </w:r>
+        <w:r>
+          <w:rPr>
+            <w:rStyle w:val="Hyperlink"/>
+            <w:rFonts w:hint="eastAsia"/>
+          </w:rPr>
+          <w:t xml:space="preserve">等</w:t>
+        </w:r>
+        <w:r>
+          <w:rPr>
+            <w:rStyle w:val="Hyperlink"/>
+          </w:rPr>
+          <w:t xml:space="preserve"> </w:t>
+        </w:r>
+        <w:r>
+          <w:rPr>
+            <w:rStyle w:val="Hyperlink"/>
+            <w:rFonts w:hint="eastAsia"/>
+          </w:rPr>
+          <w:t xml:space="preserve">2025年</w:t>
+        </w:r>
+      </w:hyperlink>
+      <w:r>
+        <w:t xml:space="preserve">)</w:t>
+      </w:r>
+      <w:r>
+        <w:t xml:space="preserve">。</w:t>
+      </w:r>
+    </w:p>
+    <w:p>
+      <w:pPr>
+        <w:pStyle w:val="BodyText"/>
+      </w:pPr>
+      <w:r>
+        <w:rPr>
+          <w:rFonts w:hint="eastAsia"/>
+        </w:rPr>
+        <w:t xml:space="preserve">病毒负荷和免疫抑制暴露必须进入同一个决策模型。对肾移植而言，BK</w:t>
+      </w:r>
+      <w:r>
+        <w:t xml:space="preserve"> </w:t>
+      </w:r>
+      <w:r>
+        <w:rPr>
+          <w:rFonts w:hint="eastAsia"/>
+        </w:rPr>
+        <w:t xml:space="preserve">病毒载量、尿液趋化因子、dd-cfDNA</w:t>
+      </w:r>
+      <w:r>
+        <w:t xml:space="preserve"> </w:t>
+      </w:r>
+      <w:r>
+        <w:rPr>
+          <w:rFonts w:hint="eastAsia"/>
+        </w:rPr>
+        <w:t xml:space="preserve">和肌酐变化共同决定是减免疫、活检还是抗病毒/支持治疗；对心肺移植而言，CMV、呼吸道病毒、细菌/真菌感染和</w:t>
       </w:r>
       <w:r>
         <w:t xml:space="preserve"> dd-cfDNA </w:t>
@@ -1290,7 +3890,65 @@
         <w:rPr>
           <w:rFonts w:hint="eastAsia"/>
         </w:rPr>
-        <w:t xml:space="preserve">升高但感染证据充分的情境。</w:t>
+        <w:t xml:space="preserve">同时升高时，贸然强化免疫抑制可能造成更大风险。TTV</w:t>
+      </w:r>
+      <w:r>
+        <w:t xml:space="preserve"> </w:t>
+      </w:r>
+      <w:r>
+        <w:rPr>
+          <w:rFonts w:hint="eastAsia"/>
+        </w:rPr>
+        <w:t xml:space="preserve">等病毒负荷和细胞功能测定可作为过度免疫抑制风险的反向轴，与</w:t>
+      </w:r>
+      <w:r>
+        <w:t xml:space="preserve"> dd-cfDNA </w:t>
+      </w:r>
+      <w:r>
+        <w:rPr>
+          <w:rFonts w:hint="eastAsia"/>
+        </w:rPr>
+        <w:t xml:space="preserve">代表的拒斥/损伤轴共同服务精准免疫抑制</w:t>
+      </w:r>
+      <w:r>
+        <w:t xml:space="preserve">(</w:t>
+      </w:r>
+      <w:hyperlink w:anchor="ref-predictingoverimmunosuppression2024">
+        <w:r>
+          <w:rPr>
+            <w:rStyle w:val="Hyperlink"/>
+          </w:rPr>
+          <w:t xml:space="preserve">Zambeli-Ljepović </w:t>
+        </w:r>
+        <w:r>
+          <w:rPr>
+            <w:rStyle w:val="Hyperlink"/>
+            <w:rFonts w:hint="eastAsia"/>
+          </w:rPr>
+          <w:t xml:space="preserve">等</w:t>
+        </w:r>
+        <w:r>
+          <w:rPr>
+            <w:rStyle w:val="Hyperlink"/>
+          </w:rPr>
+          <w:t xml:space="preserve"> </w:t>
+        </w:r>
+        <w:r>
+          <w:rPr>
+            <w:rStyle w:val="Hyperlink"/>
+            <w:rFonts w:hint="eastAsia"/>
+          </w:rPr>
+          <w:t xml:space="preserve">2024年</w:t>
+        </w:r>
+      </w:hyperlink>
+      <w:r>
+        <w:t xml:space="preserve">)</w:t>
+      </w:r>
+      <w:r>
+        <w:rPr>
+          <w:rFonts w:hint="eastAsia"/>
+        </w:rPr>
+        <w:t xml:space="preserve">。临床上最有用的模型不是简单给出“排斥概率”，而是同时估计排斥风险、感染风险、免疫抑制过度风险和活检收益。</w:t>
       </w:r>
     </w:p>
     <w:p>
@@ -1301,16 +3959,16 @@
         <w:rPr>
           <w:rFonts w:hint="eastAsia"/>
         </w:rPr>
-        <w:t xml:space="preserve">机器灌注标志物可成为移植前层面的补充。扩展标准供体器官、DCD</w:t>
-      </w:r>
-      <w:r>
-        <w:t xml:space="preserve"> </w:t>
-      </w:r>
-      <w:r>
-        <w:rPr>
-          <w:rFonts w:hint="eastAsia"/>
-        </w:rPr>
-        <w:t xml:space="preserve">器官或高缺血风险移植物在植入前已经释放代谢和炎症信号；若这些灌注液指标与植入后</w:t>
+        <w:t xml:space="preserve">机器灌注标志物可成为移植前层面的先验。扩展标准供体器官、DCD</w:t>
+      </w:r>
+      <w:r>
+        <w:t xml:space="preserve"> </w:t>
+      </w:r>
+      <w:r>
+        <w:rPr>
+          <w:rFonts w:hint="eastAsia"/>
+        </w:rPr>
+        <w:t xml:space="preserve">器官或高缺血风险移植物在植入前已经释放代谢、炎症、线粒体损伤和内皮损伤信号；若这些灌注液指标与植入后</w:t>
       </w:r>
       <w:r>
         <w:t xml:space="preserve"> dd-cfDNA </w:t>
@@ -1319,7 +3977,83 @@
         <w:rPr>
           <w:rFonts w:hint="eastAsia"/>
         </w:rPr>
-        <w:t xml:space="preserve">动态连接，就可能区分“可预期的保存损伤”与“异常免疫损伤”。这对减少不必要活检和避免过早治疗尤其重要。</w:t>
+        <w:t xml:space="preserve">动态连接，就可能区分“可预期的保存损伤”与“异常免疫损伤”。肝移植</w:t>
+      </w:r>
+      <w:r>
+        <w:t xml:space="preserve"> D-HOPE </w:t>
+      </w:r>
+      <w:r>
+        <w:rPr>
+          <w:rFonts w:hint="eastAsia"/>
+        </w:rPr>
+        <w:t xml:space="preserve">灌注液</w:t>
+      </w:r>
+      <w:r>
+        <w:t xml:space="preserve"> mt-cfDNA </w:t>
+      </w:r>
+      <w:r>
+        <w:rPr>
+          <w:rFonts w:hint="eastAsia"/>
+        </w:rPr>
+        <w:t xml:space="preserve">与移植后功能和严重并发症的关联，为这种术前-术后连续建模提供了直接线索</w:t>
+      </w:r>
+      <w:r>
+        <w:t xml:space="preserve">(</w:t>
+      </w:r>
+      <w:hyperlink w:anchor="ref-circulatingcellfree2024">
+        <w:r>
+          <w:rPr>
+            <w:rStyle w:val="Hyperlink"/>
+          </w:rPr>
+          <w:t xml:space="preserve">Sorbini </w:t>
+        </w:r>
+        <w:r>
+          <w:rPr>
+            <w:rStyle w:val="Hyperlink"/>
+            <w:rFonts w:hint="eastAsia"/>
+          </w:rPr>
+          <w:t xml:space="preserve">等</w:t>
+        </w:r>
+        <w:r>
+          <w:rPr>
+            <w:rStyle w:val="Hyperlink"/>
+          </w:rPr>
+          <w:t xml:space="preserve"> </w:t>
+        </w:r>
+        <w:r>
+          <w:rPr>
+            <w:rStyle w:val="Hyperlink"/>
+            <w:rFonts w:hint="eastAsia"/>
+          </w:rPr>
+          <w:t xml:space="preserve">2024年</w:t>
+        </w:r>
+      </w:hyperlink>
+      <w:r>
+        <w:t xml:space="preserve">)</w:t>
+      </w:r>
+      <w:r>
+        <w:rPr>
+          <w:rFonts w:hint="eastAsia"/>
+        </w:rPr>
+        <w:t xml:space="preserve">。在肾、肝、心肺等高风险供体场景中，机器灌注读数可作为</w:t>
+      </w:r>
+      <w:r>
+        <w:t xml:space="preserve"> AI </w:t>
+      </w:r>
+      <w:r>
+        <w:rPr>
+          <w:rFonts w:hint="eastAsia"/>
+        </w:rPr>
+        <w:t xml:space="preserve">风险模型的先验，使术后早期</w:t>
+      </w:r>
+      <w:r>
+        <w:t xml:space="preserve"> dd-cfDNA </w:t>
+      </w:r>
+      <w:r>
+        <w:rPr>
+          <w:rFonts w:hint="eastAsia"/>
+        </w:rPr>
+        <w:t xml:space="preserve">峰值不被过度解释为排斥，从而减少不必要活检和过早治疗。</w:t>
       </w:r>
     </w:p>
     <w:bookmarkEnd w:id="13"/>
@@ -1343,7 +4077,7 @@
         <w:rPr>
           <w:rFonts w:hint="eastAsia"/>
         </w:rPr>
-        <w:t xml:space="preserve">临床应用可以先落在四类场景。低风险稳定患者若</w:t>
+        <w:t xml:space="preserve">临床应用可以先落在五类场景。第一是稳定低风险随访：若</w:t>
       </w:r>
       <w:r>
         <w:t xml:space="preserve"> dd-cfDNA </w:t>
@@ -1361,7 +4095,7 @@
         <w:rPr>
           <w:rFonts w:hint="eastAsia"/>
         </w:rPr>
-        <w:t xml:space="preserve">阴性、功能稳定且尿液/转录组无炎症信号，协议活检的收益可能下降。高风险患者，如免疫不依从、DSA</w:t>
+        <w:t xml:space="preserve">阴性、功能稳定且尿液/转录组无炎症信号，协议活检的边际收益可能下降，复查间隔可更个体化。第二是高风险筛查：免疫不依从、DSA</w:t>
       </w:r>
       <w:r>
         <w:t xml:space="preserve"> </w:t>
@@ -1373,22 +4107,123 @@
         <w:t xml:space="preserve">新发、既往</w:t>
       </w:r>
       <w:r>
-        <w:t xml:space="preserve"> </w:t>
-      </w:r>
-      <w:r>
-        <w:rPr>
-          <w:rFonts w:hint="eastAsia"/>
-        </w:rPr>
-        <w:t xml:space="preserve">ABMR、边缘供体器官或感染后免疫调节患者，dd-cfDNA</w:t>
-      </w:r>
-      <w:r>
-        <w:t xml:space="preserve"> </w:t>
-      </w:r>
-      <w:r>
-        <w:rPr>
-          <w:rFonts w:hint="eastAsia"/>
-        </w:rPr>
-        <w:t xml:space="preserve">趋势可帮助决定活检时点。ABMR</w:t>
+        <w:t xml:space="preserve"> ABMR、HLA class II eplet mismatch </w:t>
+      </w:r>
+      <w:r>
+        <w:rPr>
+          <w:rFonts w:hint="eastAsia"/>
+        </w:rPr>
+        <w:t xml:space="preserve">高、边缘供体器官或感染后免疫调节患者，dd-cfDNA</w:t>
+      </w:r>
+      <w:r>
+        <w:t xml:space="preserve"> </w:t>
+      </w:r>
+      <w:r>
+        <w:rPr>
+          <w:rFonts w:hint="eastAsia"/>
+        </w:rPr>
+        <w:t xml:space="preserve">趋势可帮助决定活检时点和随访密度</w:t>
+      </w:r>
+      <w:r>
+        <w:t xml:space="preserve">(</w:t>
+      </w:r>
+      <w:hyperlink w:anchor="ref-donorderivedcell20232">
+        <w:r>
+          <w:rPr>
+            <w:rStyle w:val="Hyperlink"/>
+          </w:rPr>
+          <w:t xml:space="preserve">González-López </w:t>
+        </w:r>
+        <w:r>
+          <w:rPr>
+            <w:rStyle w:val="Hyperlink"/>
+            <w:rFonts w:hint="eastAsia"/>
+          </w:rPr>
+          <w:t xml:space="preserve">等</w:t>
+        </w:r>
+        <w:r>
+          <w:rPr>
+            <w:rStyle w:val="Hyperlink"/>
+          </w:rPr>
+          <w:t xml:space="preserve"> </w:t>
+        </w:r>
+        <w:r>
+          <w:rPr>
+            <w:rStyle w:val="Hyperlink"/>
+            <w:rFonts w:hint="eastAsia"/>
+          </w:rPr>
+          <w:t xml:space="preserve">2023年</w:t>
+        </w:r>
+      </w:hyperlink>
+      <w:r>
+        <w:t xml:space="preserve">;</w:t>
+      </w:r>
+      <w:r>
+        <w:t xml:space="preserve"> </w:t>
+      </w:r>
+      <w:hyperlink w:anchor="ref-elevationofdonor2024">
+        <w:r>
+          <w:rPr>
+            <w:rStyle w:val="Hyperlink"/>
+          </w:rPr>
+          <w:t xml:space="preserve">Bromberg </w:t>
+        </w:r>
+        <w:r>
+          <w:rPr>
+            <w:rStyle w:val="Hyperlink"/>
+            <w:rFonts w:hint="eastAsia"/>
+          </w:rPr>
+          <w:t xml:space="preserve">等</w:t>
+        </w:r>
+        <w:r>
+          <w:rPr>
+            <w:rStyle w:val="Hyperlink"/>
+          </w:rPr>
+          <w:t xml:space="preserve"> </w:t>
+        </w:r>
+        <w:r>
+          <w:rPr>
+            <w:rStyle w:val="Hyperlink"/>
+            <w:rFonts w:hint="eastAsia"/>
+          </w:rPr>
+          <w:t xml:space="preserve">2024年</w:t>
+        </w:r>
+      </w:hyperlink>
+      <w:r>
+        <w:t xml:space="preserve">)</w:t>
+      </w:r>
+      <w:r>
+        <w:rPr>
+          <w:rFonts w:hint="eastAsia"/>
+        </w:rPr>
+        <w:t xml:space="preserve">。第三是</w:t>
+      </w:r>
+      <w:r>
+        <w:t xml:space="preserve"> for-cause </w:t>
+      </w:r>
+      <w:r>
+        <w:rPr>
+          <w:rFonts w:hint="eastAsia"/>
+        </w:rPr>
+        <w:t xml:space="preserve">诊断：当肌酐、蛋白尿、肝酶、肺功能或心功能异常时，dd-cfDNA</w:t>
+      </w:r>
+      <w:r>
+        <w:t xml:space="preserve"> </w:t>
+      </w:r>
+      <w:r>
+        <w:rPr>
+          <w:rFonts w:hint="eastAsia"/>
+        </w:rPr>
+        <w:t xml:space="preserve">可以提高对实质损伤的判断，但病因仍需结合</w:t>
+      </w:r>
+      <w:r>
+        <w:t xml:space="preserve"> </w:t>
+      </w:r>
+      <w:r>
+        <w:rPr>
+          <w:rFonts w:hint="eastAsia"/>
+        </w:rPr>
+        <w:t xml:space="preserve">DSA、病毒、影像和组织学。第四是治疗反应监测：ABMR</w:t>
       </w:r>
       <w:r>
         <w:t xml:space="preserve"> </w:t>
@@ -1415,17 +4250,26 @@
         <w:rPr>
           <w:rFonts w:hint="eastAsia"/>
         </w:rPr>
-        <w:t xml:space="preserve">是否下降可能比单一功能指标更快反映组织损伤缓解</w:t>
+        <w:t xml:space="preserve">下降可能比单一功能指标更快反映组织损伤缓解；若功能改善但</w:t>
+      </w:r>
+      <w:r>
+        <w:t xml:space="preserve"> dd-cfDNA </w:t>
+      </w:r>
+      <w:r>
+        <w:rPr>
+          <w:rFonts w:hint="eastAsia"/>
+        </w:rPr>
+        <w:t xml:space="preserve">持续升高，则应警惕残余微血管炎症、持续感染或其他隐匿损伤</w:t>
       </w:r>
       <w:r>
         <w:t xml:space="preserve">(</w:t>
       </w:r>
-      <w:hyperlink w:anchor="ref-elevationofdonor2024">
-        <w:r>
-          <w:rPr>
-            <w:rStyle w:val="Hyperlink"/>
-          </w:rPr>
-          <w:t xml:space="preserve">Bromberg </w:t>
+      <w:hyperlink w:anchor="ref-associationofblood2025">
+        <w:r>
+          <w:rPr>
+            <w:rStyle w:val="Hyperlink"/>
+          </w:rPr>
+          <w:t xml:space="preserve">Akifova </w:t>
         </w:r>
         <w:r>
           <w:rPr>
@@ -1445,21 +4289,375 @@
             <w:rStyle w:val="Hyperlink"/>
             <w:rFonts w:hint="eastAsia"/>
           </w:rPr>
+          <w:t xml:space="preserve">2025年</w:t>
+        </w:r>
+      </w:hyperlink>
+      <w:r>
+        <w:t xml:space="preserve">;</w:t>
+      </w:r>
+      <w:r>
+        <w:t xml:space="preserve"> </w:t>
+      </w:r>
+      <w:hyperlink w:anchor="ref-donorderivedcell20244">
+        <w:r>
+          <w:rPr>
+            <w:rStyle w:val="Hyperlink"/>
+          </w:rPr>
+          <w:t xml:space="preserve">Osmanodja </w:t>
+        </w:r>
+        <w:r>
+          <w:rPr>
+            <w:rStyle w:val="Hyperlink"/>
+            <w:rFonts w:hint="eastAsia"/>
+          </w:rPr>
+          <w:t xml:space="preserve">等</w:t>
+        </w:r>
+        <w:r>
+          <w:rPr>
+            <w:rStyle w:val="Hyperlink"/>
+          </w:rPr>
+          <w:t xml:space="preserve"> </w:t>
+        </w:r>
+        <w:r>
+          <w:rPr>
+            <w:rStyle w:val="Hyperlink"/>
+            <w:rFonts w:hint="eastAsia"/>
+          </w:rPr>
           <w:t xml:space="preserve">2024年</w:t>
         </w:r>
       </w:hyperlink>
       <w:r>
+        <w:t xml:space="preserve">)</w:t>
+      </w:r>
+      <w:r>
+        <w:rPr>
+          <w:rFonts w:hint="eastAsia"/>
+        </w:rPr>
+        <w:t xml:space="preserve">。第五是免疫抑制精准化：dd-cfDNA</w:t>
+      </w:r>
+      <w:r>
+        <w:t xml:space="preserve"> </w:t>
+      </w:r>
+      <w:r>
+        <w:rPr>
+          <w:rFonts w:hint="eastAsia"/>
+        </w:rPr>
+        <w:t xml:space="preserve">代表低免疫抑制/排斥风险的一端，病毒负荷、TTV、机会感染、肿瘤和细胞功能测定代表过度免疫抑制的一端，二者共同决定减药、维持或强化治疗。</w:t>
+      </w:r>
+    </w:p>
+    <w:p>
+      <w:pPr>
+        <w:pStyle w:val="BodyText"/>
+      </w:pPr>
+      <w:r>
+        <w:rPr>
+          <w:rFonts w:hint="eastAsia"/>
+        </w:rPr>
+        <w:t xml:space="preserve">过度诊断风险贯穿所有场景。dd-cfDNA</w:t>
+      </w:r>
+      <w:r>
+        <w:t xml:space="preserve"> </w:t>
+      </w:r>
+      <w:r>
+        <w:rPr>
+          <w:rFonts w:hint="eastAsia"/>
+        </w:rPr>
+        <w:t xml:space="preserve">检测越敏感，越容易发现亚临床、短暂或非排斥性损伤；如果临床路径把每一次升高都转化为活检或抗排斥治疗，就可能增加医疗负担、患者焦虑、感染风险和药物毒性。心移植中，GEP</w:t>
+      </w:r>
+      <w:r>
+        <w:t xml:space="preserve"> </w:t>
+      </w:r>
+      <w:r>
+        <w:rPr>
+          <w:rFonts w:hint="eastAsia"/>
+        </w:rPr>
+        <w:t xml:space="preserve">和</w:t>
+      </w:r>
+      <w:r>
+        <w:t xml:space="preserve"> dd-cfDNA </w:t>
+      </w:r>
+      <w:r>
+        <w:rPr>
+          <w:rFonts w:hint="eastAsia"/>
+        </w:rPr>
+        <w:t xml:space="preserve">联合监测曾出现检测升高导致心内膜活检增加但阳性收益有限的情况</w:t>
+      </w:r>
+      <w:r>
+        <w:t xml:space="preserve">(</w:t>
+      </w:r>
+      <w:hyperlink w:anchor="ref-initiationofnoninvasive2021">
+        <w:r>
+          <w:rPr>
+            <w:rStyle w:val="Hyperlink"/>
+          </w:rPr>
+          <w:t xml:space="preserve">Kewcharoen </w:t>
+        </w:r>
+        <w:r>
+          <w:rPr>
+            <w:rStyle w:val="Hyperlink"/>
+            <w:rFonts w:hint="eastAsia"/>
+          </w:rPr>
+          <w:t xml:space="preserve">等</w:t>
+        </w:r>
+        <w:r>
+          <w:rPr>
+            <w:rStyle w:val="Hyperlink"/>
+          </w:rPr>
+          <w:t xml:space="preserve"> </w:t>
+        </w:r>
+        <w:r>
+          <w:rPr>
+            <w:rStyle w:val="Hyperlink"/>
+            <w:rFonts w:hint="eastAsia"/>
+          </w:rPr>
+          <w:t xml:space="preserve">2021年</w:t>
+        </w:r>
+      </w:hyperlink>
+      <w:r>
+        <w:t xml:space="preserve">)</w:t>
+      </w:r>
+      <w:r>
+        <w:rPr>
+          <w:rFonts w:hint="eastAsia"/>
+        </w:rPr>
+        <w:t xml:space="preserve">。肝移植中，胆汁淤积可造成</w:t>
+      </w:r>
+      <w:r>
+        <w:t xml:space="preserve"> dd-cfDNA </w:t>
+      </w:r>
+      <w:r>
+        <w:rPr>
+          <w:rFonts w:hint="eastAsia"/>
+        </w:rPr>
+        <w:t xml:space="preserve">升高并降低阳性预测值</w:t>
+      </w:r>
+      <w:r>
+        <w:t xml:space="preserve">(</w:t>
+      </w:r>
+      <w:hyperlink w:anchor="ref-donorderivedcell20252">
+        <w:r>
+          <w:rPr>
+            <w:rStyle w:val="Hyperlink"/>
+          </w:rPr>
+          <w:t xml:space="preserve">Julian </w:t>
+        </w:r>
+        <w:r>
+          <w:rPr>
+            <w:rStyle w:val="Hyperlink"/>
+            <w:rFonts w:hint="eastAsia"/>
+          </w:rPr>
+          <w:t xml:space="preserve">等</w:t>
+        </w:r>
+        <w:r>
+          <w:rPr>
+            <w:rStyle w:val="Hyperlink"/>
+          </w:rPr>
+          <w:t xml:space="preserve"> </w:t>
+        </w:r>
+        <w:r>
+          <w:rPr>
+            <w:rStyle w:val="Hyperlink"/>
+            <w:rFonts w:hint="eastAsia"/>
+          </w:rPr>
+          <w:t xml:space="preserve">2025年</w:t>
+        </w:r>
+      </w:hyperlink>
+      <w:r>
+        <w:t xml:space="preserve">)</w:t>
+      </w:r>
+      <w:r>
+        <w:rPr>
+          <w:rFonts w:hint="eastAsia"/>
+        </w:rPr>
+        <w:t xml:space="preserve">。肺移植中，感染和</w:t>
+      </w:r>
+      <w:r>
+        <w:t xml:space="preserve"> CLAD </w:t>
+      </w:r>
+      <w:r>
+        <w:rPr>
+          <w:rFonts w:hint="eastAsia"/>
+        </w:rPr>
+        <w:t xml:space="preserve">可与排斥共享损伤信号</w:t>
+      </w:r>
+      <w:r>
+        <w:t xml:space="preserve">(</w:t>
+      </w:r>
+      <w:hyperlink w:anchor="ref-clinicalvalidationof2022">
+        <w:r>
+          <w:rPr>
+            <w:rStyle w:val="Hyperlink"/>
+          </w:rPr>
+          <w:t xml:space="preserve">J. P. Rosenheck </w:t>
+        </w:r>
+        <w:r>
+          <w:rPr>
+            <w:rStyle w:val="Hyperlink"/>
+            <w:rFonts w:hint="eastAsia"/>
+          </w:rPr>
+          <w:t xml:space="preserve">等</w:t>
+        </w:r>
+        <w:r>
+          <w:rPr>
+            <w:rStyle w:val="Hyperlink"/>
+          </w:rPr>
+          <w:t xml:space="preserve"> </w:t>
+        </w:r>
+        <w:r>
+          <w:rPr>
+            <w:rStyle w:val="Hyperlink"/>
+            <w:rFonts w:hint="eastAsia"/>
+          </w:rPr>
+          <w:t xml:space="preserve">2022年</w:t>
+        </w:r>
+      </w:hyperlink>
+      <w:r>
+        <w:t xml:space="preserve">)</w:t>
+      </w:r>
+      <w:r>
+        <w:rPr>
+          <w:rFonts w:hint="eastAsia"/>
+        </w:rPr>
+        <w:t xml:space="preserve">。因此，检测前应明确</w:t>
+      </w:r>
+      <w:r>
+        <w:t xml:space="preserve"> context of </w:t>
+      </w:r>
+      <w:r>
+        <w:rPr>
+          <w:rFonts w:hint="eastAsia"/>
+        </w:rPr>
+        <w:t xml:space="preserve">use：是为了排除活动性损伤、提高活检收益、监测治疗反应，还是支持免疫抑制调整。没有预设动作阈值的检测，会把“信息增加”误变成“临床收益”。</w:t>
+      </w:r>
+    </w:p>
+    <w:p>
+      <w:pPr>
+        <w:pStyle w:val="BodyText"/>
+      </w:pPr>
+      <w:r>
+        <w:t xml:space="preserve">AI </w:t>
+      </w:r>
+      <w:r>
+        <w:rPr>
+          <w:rFonts w:hint="eastAsia"/>
+        </w:rPr>
+        <w:t xml:space="preserve">风险模型的价值在于整合这些互相冲突的证据，但模型必须可解释。输入层应包含器官类型、术后时间、供体质量和机器灌注先验、dd-cfDNA</w:t>
+      </w:r>
+      <w:r>
+        <w:t xml:space="preserve"> fraction </w:t>
+      </w:r>
+      <w:r>
+        <w:rPr>
+          <w:rFonts w:hint="eastAsia"/>
+        </w:rPr>
+        <w:t xml:space="preserve">与</w:t>
+      </w:r>
+      <w:r>
+        <w:t xml:space="preserve"> </w:t>
+      </w:r>
+      <w:r>
+        <w:rPr>
+          <w:rFonts w:hint="eastAsia"/>
+        </w:rPr>
+        <w:t xml:space="preserve">quantity、历史基线和相对变化、DSA/eplet</w:t>
+      </w:r>
+      <w:r>
+        <w:t xml:space="preserve"> </w:t>
+      </w:r>
+      <w:r>
+        <w:rPr>
+          <w:rFonts w:hint="eastAsia"/>
+        </w:rPr>
+        <w:t xml:space="preserve">mismatch、尿液/血液转录组、蛋白组或</w:t>
+      </w:r>
+      <w:r>
+        <w:t xml:space="preserve"> </w:t>
+      </w:r>
+      <w:r>
+        <w:rPr>
+          <w:rFonts w:hint="eastAsia"/>
+        </w:rPr>
+        <w:t xml:space="preserve">miRNA、病毒负荷、药物浓度、感染证据和近期干预。输出层不应只有黑箱风险分，而应给出分解后的风险贡献：例如“ABMR/MVI</w:t>
+      </w:r>
+      <w:r>
+        <w:t xml:space="preserve"> </w:t>
+      </w:r>
+      <w:r>
+        <w:rPr>
+          <w:rFonts w:hint="eastAsia"/>
+        </w:rPr>
+        <w:t xml:space="preserve">风险升高，主要由</w:t>
+      </w:r>
+      <w:r>
+        <w:t xml:space="preserve"> DSA、dd-cfDNA quantity </w:t>
+      </w:r>
+      <w:r>
+        <w:rPr>
+          <w:rFonts w:hint="eastAsia"/>
+        </w:rPr>
+        <w:t xml:space="preserve">和微血管损伤相关证据驱动”，或“损伤信号升高但感染证据强，建议先复测和排除感染后再决定活检”。MMDx</w:t>
+      </w:r>
+      <w:r>
+        <w:t xml:space="preserve"> </w:t>
+      </w:r>
+      <w:r>
+        <w:rPr>
+          <w:rFonts w:hint="eastAsia"/>
+        </w:rPr>
+        <w:t xml:space="preserve">等分子分类已经展示了机器学习解释组织状态的可能性，但临床</w:t>
+      </w:r>
+      <w:r>
+        <w:t xml:space="preserve"> AI </w:t>
+      </w:r>
+      <w:r>
+        <w:rPr>
+          <w:rFonts w:hint="eastAsia"/>
+        </w:rPr>
+        <w:t xml:space="preserve">模型还需要校准、外部验证、决策曲线分析和前瞻性影响评价</w:t>
+      </w:r>
+      <w:r>
+        <w:t xml:space="preserve">(</w:t>
+      </w:r>
+      <w:hyperlink w:anchor="ref-themolecularphenotype2023">
+        <w:r>
+          <w:rPr>
+            <w:rStyle w:val="Hyperlink"/>
+          </w:rPr>
+          <w:t xml:space="preserve">Halloran </w:t>
+        </w:r>
+        <w:r>
+          <w:rPr>
+            <w:rStyle w:val="Hyperlink"/>
+            <w:rFonts w:hint="eastAsia"/>
+          </w:rPr>
+          <w:t xml:space="preserve">等</w:t>
+        </w:r>
+        <w:r>
+          <w:rPr>
+            <w:rStyle w:val="Hyperlink"/>
+          </w:rPr>
+          <w:t xml:space="preserve"> </w:t>
+        </w:r>
+        <w:r>
+          <w:rPr>
+            <w:rStyle w:val="Hyperlink"/>
+            <w:rFonts w:hint="eastAsia"/>
+          </w:rPr>
+          <w:t xml:space="preserve">2023年</w:t>
+        </w:r>
+      </w:hyperlink>
+      <w:r>
         <w:t xml:space="preserve">;</w:t>
       </w:r>
       <w:r>
         <w:t xml:space="preserve"> </w:t>
       </w:r>
-      <w:hyperlink w:anchor="ref-associationofblood2025">
-        <w:r>
-          <w:rPr>
-            <w:rStyle w:val="Hyperlink"/>
-          </w:rPr>
-          <w:t xml:space="preserve">Akifova </w:t>
+      <w:hyperlink w:anchor="ref-improvingdiagnosticperformance2025">
+        <w:r>
+          <w:rPr>
+            <w:rStyle w:val="Hyperlink"/>
+          </w:rPr>
+          <w:t xml:space="preserve">Benning </w:t>
         </w:r>
         <w:r>
           <w:rPr>
@@ -1486,19 +4684,81 @@
         <w:t xml:space="preserve">)</w:t>
       </w:r>
       <w:r>
-        <w:rPr>
-          <w:rFonts w:hint="eastAsia"/>
-        </w:rPr>
-        <w:t xml:space="preserve">。在免疫抑制精准化方面，dd-cfDNA</w:t>
-      </w:r>
-      <w:r>
-        <w:t xml:space="preserve"> </w:t>
-      </w:r>
-      <w:r>
-        <w:rPr>
-          <w:rFonts w:hint="eastAsia"/>
-        </w:rPr>
-        <w:t xml:space="preserve">与病毒负荷、TTV、药物浓度和感染风险联合，可服务“减免疫”与“防排斥”的平衡。</w:t>
+        <w:t xml:space="preserve">。</w:t>
+      </w:r>
+    </w:p>
+    <w:p>
+      <w:pPr>
+        <w:pStyle w:val="BodyText"/>
+      </w:pPr>
+      <w:r>
+        <w:rPr>
+          <w:rFonts w:hint="eastAsia"/>
+        </w:rPr>
+        <w:t xml:space="preserve">临床决策试验应从诊断准确性转向患者和系统结局。理想设计不是简单比较</w:t>
+      </w:r>
+      <w:r>
+        <w:t xml:space="preserve"> dd-cfDNA </w:t>
+      </w:r>
+      <w:r>
+        <w:rPr>
+          <w:rFonts w:hint="eastAsia"/>
+        </w:rPr>
+        <w:t xml:space="preserve">阳性与活检诊断，而是随机或阶梯楔形比较“常规监测”与“dd-cfDNA</w:t>
+      </w:r>
+      <w:r>
+        <w:t xml:space="preserve"> </w:t>
+      </w:r>
+      <w:r>
+        <w:rPr>
+          <w:rFonts w:hint="eastAsia"/>
+        </w:rPr>
+        <w:t xml:space="preserve">多组学决策算法”。入组应按器官和风险分层，包括肾移植</w:t>
+      </w:r>
+      <w:r>
+        <w:t xml:space="preserve"> </w:t>
+      </w:r>
+      <w:r>
+        <w:rPr>
+          <w:rFonts w:hint="eastAsia"/>
+        </w:rPr>
+        <w:t xml:space="preserve">dnDSA/既往</w:t>
+      </w:r>
+      <w:r>
+        <w:t xml:space="preserve"> ABMR </w:t>
+      </w:r>
+      <w:r>
+        <w:rPr>
+          <w:rFonts w:hint="eastAsia"/>
+        </w:rPr>
+        <w:t xml:space="preserve">人群、心移植低危监测和</w:t>
+      </w:r>
+      <w:r>
+        <w:t xml:space="preserve"> DSA </w:t>
+      </w:r>
+      <w:r>
+        <w:rPr>
+          <w:rFonts w:hint="eastAsia"/>
+        </w:rPr>
+        <w:t xml:space="preserve">阳性人群、肺移植感染/CLAD</w:t>
+      </w:r>
+      <w:r>
+        <w:t xml:space="preserve"> </w:t>
+      </w:r>
+      <w:r>
+        <w:rPr>
+          <w:rFonts w:hint="eastAsia"/>
+        </w:rPr>
+        <w:t xml:space="preserve">高风险人群、肝移植高缺血或胆道风险人群以及多器官移植。终点应包括活检数量、活检阳性率、诊断延误、过度治疗、感染和肿瘤事件、患者焦虑、成本、eGFR/FEV1/LVEF/肝功能轨迹、移植物存活和死亡。只有当算法减少无效活检和误治，同时不增加漏诊或长期损伤时，dd-cfDNA</w:t>
+      </w:r>
+      <w:r>
+        <w:t xml:space="preserve"> </w:t>
+      </w:r>
+      <w:r>
+        <w:rPr>
+          <w:rFonts w:hint="eastAsia"/>
+        </w:rPr>
+        <w:t xml:space="preserve">才真正从“优秀标志物”变成“有效临床策略”。</w:t>
       </w:r>
     </w:p>
     <w:bookmarkEnd w:id="14"/>
@@ -1544,7 +4804,7 @@
         <w:rPr>
           <w:rFonts w:hint="eastAsia"/>
         </w:rPr>
-        <w:t xml:space="preserve">新发期和治疗后不应使用同一解释框架。</w:t>
+        <w:t xml:space="preserve">新发期、治疗后和多器官移植不应使用同一解释框架；肺移植尤其需要把相对变化和参考变化值纳入常规解释。</w:t>
       </w:r>
     </w:p>
     <w:p>
@@ -1562,13 +4822,13 @@
         <w:t xml:space="preserve">同时报告</w:t>
       </w:r>
       <w:r>
-        <w:t xml:space="preserve"> fraction、absolute quantity </w:t>
-      </w:r>
-      <w:r>
-        <w:rPr>
-          <w:rFonts w:hint="eastAsia"/>
-        </w:rPr>
-        <w:t xml:space="preserve">和个体化变化率。比例值容易受受者</w:t>
+        <w:t xml:space="preserve"> fraction、absolute </w:t>
+      </w:r>
+      <w:r>
+        <w:rPr>
+          <w:rFonts w:hint="eastAsia"/>
+        </w:rPr>
+        <w:t xml:space="preserve">quantity、总</w:t>
       </w:r>
       <w:r>
         <w:t xml:space="preserve"> cfDNA </w:t>
@@ -1577,7 +4837,16 @@
         <w:rPr>
           <w:rFonts w:hint="eastAsia"/>
         </w:rPr>
-        <w:t xml:space="preserve">背景影响，绝对量与趋势可提供互补信息。</w:t>
+        <w:t xml:space="preserve">背景和个体化变化率。比例值容易受受者</w:t>
+      </w:r>
+      <w:r>
+        <w:t xml:space="preserve"> cfDNA </w:t>
+      </w:r>
+      <w:r>
+        <w:rPr>
+          <w:rFonts w:hint="eastAsia"/>
+        </w:rPr>
+        <w:t xml:space="preserve">背景影响，绝对量也受平台和前分析因素影响；二者结合比任何单一阈值更接近真实损伤判断。</w:t>
       </w:r>
     </w:p>
     <w:p>
@@ -1610,7 +4879,16 @@
         <w:rPr>
           <w:rFonts w:hint="eastAsia"/>
         </w:rPr>
-        <w:t xml:space="preserve">分子病理的前瞻性决策试验。终点不应只看诊断准确性，还应看活检减少、误治减少、排斥延误减少和长期功能。</w:t>
+        <w:t xml:space="preserve">转录组/蛋白组</w:t>
+      </w:r>
+      <w:r>
+        <w:t xml:space="preserve"> + </w:t>
+      </w:r>
+      <w:r>
+        <w:rPr>
+          <w:rFonts w:hint="eastAsia"/>
+        </w:rPr>
+        <w:t xml:space="preserve">分子病理的前瞻性决策试验。终点不应只看诊断准确性，还应看活检减少、误治减少、排斥延误减少、感染事件和长期功能。</w:t>
       </w:r>
     </w:p>
     <w:p>
@@ -1643,7 +4921,7 @@
         <w:rPr>
           <w:rFonts w:hint="eastAsia"/>
         </w:rPr>
-        <w:t xml:space="preserve">术后曲线的先验。</w:t>
+        <w:t xml:space="preserve">术后曲线的先验，帮助区分保存损伤、早期功能不全和异常免疫损伤。</w:t>
       </w:r>
     </w:p>
     <w:p>
@@ -1667,7 +4945,22 @@
         <w:rPr>
           <w:rFonts w:hint="eastAsia"/>
         </w:rPr>
-        <w:t xml:space="preserve">风险模型。模型应输出“可能病因组合”和“建议下一步证据”，而不是黑箱风险分。临床可用性取决于它能否告诉医生该活检、复查、调整免疫抑制还是寻找感染。</w:t>
+        <w:t xml:space="preserve">风险模型。模型应输出“可能病因组合”、“证据冲突点”和“建议下一步证据”，而不是黑箱风险分。临床可用性取决于它能否告诉医生该活检、复查、调整免疫抑制还是寻找感染。</w:t>
+      </w:r>
+    </w:p>
+    <w:p>
+      <w:pPr>
+        <w:pStyle w:val="Compact"/>
+        <w:numPr>
+          <w:ilvl w:val="0"/>
+          <w:numId w:val="1001"/>
+        </w:numPr>
+      </w:pPr>
+      <w:r>
+        <w:rPr>
+          <w:rFonts w:hint="eastAsia"/>
+        </w:rPr>
+        <w:t xml:space="preserve">明确过度诊断的停止规则。连续低位、短暂孤立升高、感染证据充分或术前灌注先验可解释的早期峰值，都应有相应的复测和观察路径，避免把检测敏感性误转化为不必要治疗。</w:t>
       </w:r>
     </w:p>
     <w:bookmarkEnd w:id="15"/>
@@ -1703,7 +4996,43 @@
         <w:rPr>
           <w:rFonts w:hint="eastAsia"/>
         </w:rPr>
-        <w:t xml:space="preserve">不是活检的简单替代品，也不是排斥的单一同义词。它更合适的位置，是作为多证据动态监测系统中的核心损伤轴，与免疫风险、感染风险、组织/尿液组学和移植前器官质量共同构成临床决策模型。未来</w:t>
+        <w:t xml:space="preserve">不是活检的简单替代品，也不是排斥的单一同义词。肾移植证据支持其用于损伤监测、ABMR/MVI</w:t>
+      </w:r>
+      <w:r>
+        <w:t xml:space="preserve"> </w:t>
+      </w:r>
+      <w:r>
+        <w:rPr>
+          <w:rFonts w:hint="eastAsia"/>
+        </w:rPr>
+        <w:t xml:space="preserve">风险分层和</w:t>
+      </w:r>
+      <w:r>
+        <w:t xml:space="preserve"> dnDSA </w:t>
+      </w:r>
+      <w:r>
+        <w:rPr>
+          <w:rFonts w:hint="eastAsia"/>
+        </w:rPr>
+        <w:t xml:space="preserve">场景下的活检触发，但也清楚显示</w:t>
+      </w:r>
+      <w:r>
+        <w:t xml:space="preserve"> TCMR、BK </w:t>
+      </w:r>
+      <w:r>
+        <w:rPr>
+          <w:rFonts w:hint="eastAsia"/>
+        </w:rPr>
+        <w:t xml:space="preserve">病毒、急性肾损伤和总</w:t>
+      </w:r>
+      <w:r>
+        <w:t xml:space="preserve"> cfDNA </w:t>
+      </w:r>
+      <w:r>
+        <w:rPr>
+          <w:rFonts w:hint="eastAsia"/>
+        </w:rPr>
+        <w:t xml:space="preserve">背景会限制特异性；心、肺、肝和多器官移植则各有基线、动力学和混杂因素。它更合适的位置，是作为多证据动态监测系统中的核心损伤轴，与免疫风险、感染风险、组织/尿液组学、病毒负荷、免疫抑制暴露和移植前器官质量共同构成临床决策模型。未来</w:t>
       </w:r>
       <w:r>
         <w:t xml:space="preserve"> 3-5 </w:t>
@@ -1712,7 +5041,7 @@
         <w:rPr>
           <w:rFonts w:hint="eastAsia"/>
         </w:rPr>
-        <w:t xml:space="preserve">年，能进入常规路径的方案，应当是那些能够减少不必要活检、避免过度治疗并改善长期结局的整合型监测策略。</w:t>
+        <w:t xml:space="preserve">年，能进入常规路径的方案，应当是那些经过前瞻性决策试验证明能够减少不必要活检、避免过度治疗、降低漏诊风险并改善长期结局的整合型监测策略。</w:t>
       </w:r>
     </w:p>
     <w:bookmarkStart w:id="196" w:name="refs"/>

</xml_diff>